<commit_message>
Assignment 2 - Part 1 document
Signed-off-by: uofl-sbabb <sbabb131@gmail.com>
</commit_message>
<xml_diff>
--- a/Project2/Assignment2-01.docx
+++ b/Project2/Assignment2-01.docx
@@ -296,15 +296,55 @@
     <w:p>
       <w:pPr>
         <w:pStyle w:val="ListNumber"/>
-        <w:rPr>
-          <w:rFonts w:asciiTheme="minorBidi" w:hAnsiTheme="minorBidi"/>
-        </w:rPr>
-      </w:pPr>
-      <w:r>
-        <w:rPr>
-          <w:rFonts w:asciiTheme="minorBidi" w:hAnsiTheme="minorBidi"/>
-        </w:rPr>
-        <w:t>What data quality issues exist (missing values, duplicates, type problems, invalid ranges, inconsistent categories)?</w:t>
+        <w:numPr>
+          <w:ilvl w:val="0"/>
+          <w:numId w:val="0"/>
+        </w:numPr>
+        <w:ind w:left="360"/>
+        <w:rPr>
+          <w:rFonts w:asciiTheme="minorBidi" w:hAnsiTheme="minorBidi"/>
+        </w:rPr>
+      </w:pPr>
+      <w:r>
+        <w:rPr>
+          <w:rFonts w:asciiTheme="minorBidi" w:hAnsiTheme="minorBidi"/>
+        </w:rPr>
+        <w:lastRenderedPageBreak/>
+        <w:drawing>
+          <wp:inline distT="0" distB="0" distL="0" distR="0" wp14:anchorId="18DB5710" wp14:editId="31A7C992">
+            <wp:extent cx="5113463" cy="3360711"/>
+            <wp:effectExtent l="0" t="0" r="0" b="0"/>
+            <wp:docPr id="627167871" name="Picture 1"/>
+            <wp:cNvGraphicFramePr>
+              <a:graphicFrameLocks xmlns:a="http://schemas.openxmlformats.org/drawingml/2006/main" noChangeAspect="1"/>
+            </wp:cNvGraphicFramePr>
+            <a:graphic xmlns:a="http://schemas.openxmlformats.org/drawingml/2006/main">
+              <a:graphicData uri="http://schemas.openxmlformats.org/drawingml/2006/picture">
+                <pic:pic xmlns:pic="http://schemas.openxmlformats.org/drawingml/2006/picture">
+                  <pic:nvPicPr>
+                    <pic:cNvPr id="627167871" name=""/>
+                    <pic:cNvPicPr/>
+                  </pic:nvPicPr>
+                  <pic:blipFill>
+                    <a:blip r:embed="rId8"/>
+                    <a:stretch>
+                      <a:fillRect/>
+                    </a:stretch>
+                  </pic:blipFill>
+                  <pic:spPr>
+                    <a:xfrm>
+                      <a:off x="0" y="0"/>
+                      <a:ext cx="5113463" cy="3360711"/>
+                    </a:xfrm>
+                    <a:prstGeom prst="rect">
+                      <a:avLst/>
+                    </a:prstGeom>
+                  </pic:spPr>
+                </pic:pic>
+              </a:graphicData>
+            </a:graphic>
+          </wp:inline>
+        </w:drawing>
       </w:r>
     </w:p>
     <w:p>
@@ -318,395 +358,1164 @@
         <w:rPr>
           <w:rFonts w:asciiTheme="minorBidi" w:hAnsiTheme="minorBidi"/>
         </w:rPr>
-        <w:t>Which issues will break analysis versus only reduce accuracy?</w:t>
+        <w:t>What data quality issues exist (missing values, duplicates, type problems, invalid ranges, inconsistent categories)?</w:t>
       </w:r>
     </w:p>
     <w:p>
       <w:pPr>
         <w:pStyle w:val="ListNumber"/>
-        <w:rPr>
-          <w:rFonts w:asciiTheme="minorBidi" w:hAnsiTheme="minorBidi"/>
-        </w:rPr>
-      </w:pPr>
-      <w:r>
-        <w:rPr>
-          <w:rFonts w:asciiTheme="minorBidi" w:hAnsiTheme="minorBidi"/>
-        </w:rPr>
-        <w:t>What is your step-by-step cleaning plan?</w:t>
+        <w:numPr>
+          <w:ilvl w:val="0"/>
+          <w:numId w:val="0"/>
+        </w:numPr>
+        <w:ind w:left="360" w:hanging="360"/>
+        <w:rPr>
+          <w:rFonts w:asciiTheme="minorBidi" w:hAnsiTheme="minorBidi"/>
+        </w:rPr>
+      </w:pPr>
+      <w:r>
+        <w:rPr>
+          <w:rFonts w:asciiTheme="minorBidi" w:hAnsiTheme="minorBidi"/>
+        </w:rPr>
+        <w:t>Returns True if there are any missing values in the dataset:</w:t>
       </w:r>
     </w:p>
     <w:p>
       <w:pPr>
-        <w:pStyle w:val="Heading3"/>
-        <w:rPr>
-          <w:rFonts w:asciiTheme="minorBidi" w:hAnsiTheme="minorBidi" w:cstheme="minorBidi"/>
-        </w:rPr>
-      </w:pPr>
-      <w:r>
-        <w:rPr>
-          <w:rFonts w:asciiTheme="minorBidi" w:hAnsiTheme="minorBidi" w:cstheme="minorBidi"/>
-        </w:rPr>
-        <w:t>Q2 (25 pts) — Cleaning and Validation (Pipeline Stage: TRANSFORM)</w:t>
+        <w:pStyle w:val="ListNumber"/>
+        <w:numPr>
+          <w:ilvl w:val="0"/>
+          <w:numId w:val="0"/>
+        </w:numPr>
+        <w:ind w:left="360"/>
+        <w:rPr>
+          <w:rFonts w:asciiTheme="minorBidi" w:hAnsiTheme="minorBidi"/>
+        </w:rPr>
+      </w:pPr>
+      <w:r>
+        <w:rPr>
+          <w:rFonts w:asciiTheme="minorBidi" w:hAnsiTheme="minorBidi"/>
+        </w:rPr>
+        <w:drawing>
+          <wp:inline distT="0" distB="0" distL="0" distR="0" wp14:anchorId="45DD4B3B" wp14:editId="12974BF0">
+            <wp:extent cx="5486400" cy="1976120"/>
+            <wp:effectExtent l="0" t="0" r="0" b="5080"/>
+            <wp:docPr id="957291411" name="Picture 1"/>
+            <wp:cNvGraphicFramePr>
+              <a:graphicFrameLocks xmlns:a="http://schemas.openxmlformats.org/drawingml/2006/main" noChangeAspect="1"/>
+            </wp:cNvGraphicFramePr>
+            <a:graphic xmlns:a="http://schemas.openxmlformats.org/drawingml/2006/main">
+              <a:graphicData uri="http://schemas.openxmlformats.org/drawingml/2006/picture">
+                <pic:pic xmlns:pic="http://schemas.openxmlformats.org/drawingml/2006/picture">
+                  <pic:nvPicPr>
+                    <pic:cNvPr id="957291411" name=""/>
+                    <pic:cNvPicPr/>
+                  </pic:nvPicPr>
+                  <pic:blipFill>
+                    <a:blip r:embed="rId9"/>
+                    <a:stretch>
+                      <a:fillRect/>
+                    </a:stretch>
+                  </pic:blipFill>
+                  <pic:spPr>
+                    <a:xfrm>
+                      <a:off x="0" y="0"/>
+                      <a:ext cx="5486400" cy="1976120"/>
+                    </a:xfrm>
+                    <a:prstGeom prst="rect">
+                      <a:avLst/>
+                    </a:prstGeom>
+                  </pic:spPr>
+                </pic:pic>
+              </a:graphicData>
+            </a:graphic>
+          </wp:inline>
+        </w:drawing>
       </w:r>
     </w:p>
     <w:p>
       <w:pPr>
-        <w:rPr>
-          <w:rFonts w:asciiTheme="minorBidi" w:hAnsiTheme="minorBidi"/>
-        </w:rPr>
-      </w:pPr>
-      <w:r>
-        <w:rPr>
-          <w:rFonts w:asciiTheme="minorBidi" w:hAnsiTheme="minorBidi"/>
-        </w:rPr>
-        <w:t>Create a cleaned DataFrame named df and validate it. Minimum requirements:</w:t>
+        <w:pStyle w:val="ListNumber"/>
+        <w:numPr>
+          <w:ilvl w:val="0"/>
+          <w:numId w:val="0"/>
+        </w:numPr>
+        <w:ind w:left="360"/>
+        <w:rPr>
+          <w:rFonts w:asciiTheme="minorBidi" w:hAnsiTheme="minorBidi"/>
+        </w:rPr>
+      </w:pPr>
+      <w:r>
+        <w:rPr>
+          <w:rFonts w:asciiTheme="minorBidi" w:hAnsiTheme="minorBidi"/>
+        </w:rPr>
+        <w:drawing>
+          <wp:inline distT="0" distB="0" distL="0" distR="0" wp14:anchorId="5361E24E" wp14:editId="36286773">
+            <wp:extent cx="5486400" cy="2032000"/>
+            <wp:effectExtent l="0" t="0" r="0" b="6350"/>
+            <wp:docPr id="1847817651" name="Picture 1"/>
+            <wp:cNvGraphicFramePr>
+              <a:graphicFrameLocks xmlns:a="http://schemas.openxmlformats.org/drawingml/2006/main" noChangeAspect="1"/>
+            </wp:cNvGraphicFramePr>
+            <a:graphic xmlns:a="http://schemas.openxmlformats.org/drawingml/2006/main">
+              <a:graphicData uri="http://schemas.openxmlformats.org/drawingml/2006/picture">
+                <pic:pic xmlns:pic="http://schemas.openxmlformats.org/drawingml/2006/picture">
+                  <pic:nvPicPr>
+                    <pic:cNvPr id="1847817651" name=""/>
+                    <pic:cNvPicPr/>
+                  </pic:nvPicPr>
+                  <pic:blipFill>
+                    <a:blip r:embed="rId10"/>
+                    <a:stretch>
+                      <a:fillRect/>
+                    </a:stretch>
+                  </pic:blipFill>
+                  <pic:spPr>
+                    <a:xfrm>
+                      <a:off x="0" y="0"/>
+                      <a:ext cx="5486400" cy="2032000"/>
+                    </a:xfrm>
+                    <a:prstGeom prst="rect">
+                      <a:avLst/>
+                    </a:prstGeom>
+                  </pic:spPr>
+                </pic:pic>
+              </a:graphicData>
+            </a:graphic>
+          </wp:inline>
+        </w:drawing>
       </w:r>
     </w:p>
     <w:p>
       <w:pPr>
-        <w:pStyle w:val="ListBullet"/>
-        <w:rPr>
-          <w:rFonts w:asciiTheme="minorBidi" w:hAnsiTheme="minorBidi"/>
-        </w:rPr>
-      </w:pPr>
-      <w:r>
-        <w:rPr>
-          <w:rFonts w:asciiTheme="minorBidi" w:hAnsiTheme="minorBidi"/>
-        </w:rPr>
-        <w:t>Convert numeric columns to numeric types (handle $, commas, and blanks)</w:t>
+        <w:pStyle w:val="ListNumber"/>
+        <w:numPr>
+          <w:ilvl w:val="0"/>
+          <w:numId w:val="0"/>
+        </w:numPr>
+        <w:ind w:left="360"/>
+        <w:rPr>
+          <w:rFonts w:asciiTheme="minorBidi" w:hAnsiTheme="minorBidi"/>
+        </w:rPr>
+      </w:pPr>
+      <w:r>
+        <w:rPr>
+          <w:rFonts w:asciiTheme="minorBidi" w:hAnsiTheme="minorBidi"/>
+        </w:rPr>
+        <w:t>Return True if there are no null values in the dataset:</w:t>
       </w:r>
     </w:p>
     <w:p>
       <w:pPr>
-        <w:pStyle w:val="ListBullet"/>
-        <w:rPr>
-          <w:rFonts w:asciiTheme="minorBidi" w:hAnsiTheme="minorBidi"/>
-        </w:rPr>
-      </w:pPr>
-      <w:r>
-        <w:rPr>
-          <w:rFonts w:asciiTheme="minorBidi" w:hAnsiTheme="minorBidi"/>
-        </w:rPr>
-        <w:t>Standardize category values (trim spaces, standardize case, correct obvious typos)</w:t>
+        <w:pStyle w:val="ListNumber"/>
+        <w:numPr>
+          <w:ilvl w:val="0"/>
+          <w:numId w:val="0"/>
+        </w:numPr>
+        <w:ind w:left="360"/>
+        <w:rPr>
+          <w:rFonts w:asciiTheme="minorBidi" w:hAnsiTheme="minorBidi"/>
+        </w:rPr>
+      </w:pPr>
+      <w:r>
+        <w:rPr>
+          <w:rFonts w:asciiTheme="minorBidi" w:hAnsiTheme="minorBidi"/>
+        </w:rPr>
+        <w:lastRenderedPageBreak/>
+        <w:drawing>
+          <wp:inline distT="0" distB="0" distL="0" distR="0" wp14:anchorId="2260E4E4" wp14:editId="72C37715">
+            <wp:extent cx="5486400" cy="1888490"/>
+            <wp:effectExtent l="0" t="0" r="0" b="0"/>
+            <wp:docPr id="798013332" name="Picture 1"/>
+            <wp:cNvGraphicFramePr>
+              <a:graphicFrameLocks xmlns:a="http://schemas.openxmlformats.org/drawingml/2006/main" noChangeAspect="1"/>
+            </wp:cNvGraphicFramePr>
+            <a:graphic xmlns:a="http://schemas.openxmlformats.org/drawingml/2006/main">
+              <a:graphicData uri="http://schemas.openxmlformats.org/drawingml/2006/picture">
+                <pic:pic xmlns:pic="http://schemas.openxmlformats.org/drawingml/2006/picture">
+                  <pic:nvPicPr>
+                    <pic:cNvPr id="798013332" name=""/>
+                    <pic:cNvPicPr/>
+                  </pic:nvPicPr>
+                  <pic:blipFill>
+                    <a:blip r:embed="rId11"/>
+                    <a:stretch>
+                      <a:fillRect/>
+                    </a:stretch>
+                  </pic:blipFill>
+                  <pic:spPr>
+                    <a:xfrm>
+                      <a:off x="0" y="0"/>
+                      <a:ext cx="5486400" cy="1888490"/>
+                    </a:xfrm>
+                    <a:prstGeom prst="rect">
+                      <a:avLst/>
+                    </a:prstGeom>
+                  </pic:spPr>
+                </pic:pic>
+              </a:graphicData>
+            </a:graphic>
+          </wp:inline>
+        </w:drawing>
       </w:r>
     </w:p>
     <w:p>
       <w:pPr>
-        <w:pStyle w:val="ListBullet"/>
-        <w:rPr>
-          <w:rFonts w:asciiTheme="minorBidi" w:hAnsiTheme="minorBidi"/>
-        </w:rPr>
-      </w:pPr>
-      <w:r>
-        <w:rPr>
-          <w:rFonts w:asciiTheme="minorBidi" w:hAnsiTheme="minorBidi"/>
-        </w:rPr>
-        <w:t>Handle duplicates (define and apply a rule)</w:t>
+        <w:pStyle w:val="ListNumber"/>
+        <w:numPr>
+          <w:ilvl w:val="0"/>
+          <w:numId w:val="0"/>
+        </w:numPr>
+        <w:ind w:left="360"/>
+        <w:rPr>
+          <w:rFonts w:asciiTheme="minorBidi" w:hAnsiTheme="minorBidi"/>
+        </w:rPr>
+      </w:pPr>
+      <w:r>
+        <w:rPr>
+          <w:rFonts w:asciiTheme="minorBidi" w:hAnsiTheme="minorBidi"/>
+        </w:rPr>
+        <w:t>Get the count of total values that are not missing/also the count of missing values:</w:t>
       </w:r>
     </w:p>
     <w:p>
       <w:pPr>
-        <w:pStyle w:val="ListBullet"/>
-        <w:rPr>
-          <w:rFonts w:asciiTheme="minorBidi" w:hAnsiTheme="minorBidi"/>
-        </w:rPr>
-      </w:pPr>
-      <w:r>
-        <w:rPr>
-          <w:rFonts w:asciiTheme="minorBidi" w:hAnsiTheme="minorBidi"/>
-        </w:rPr>
-        <w:t>Handle missing values (justify your approach)</w:t>
+        <w:pStyle w:val="ListNumber"/>
+        <w:numPr>
+          <w:ilvl w:val="0"/>
+          <w:numId w:val="0"/>
+        </w:numPr>
+        <w:ind w:left="360"/>
+        <w:rPr>
+          <w:rFonts w:asciiTheme="minorBidi" w:hAnsiTheme="minorBidi"/>
+        </w:rPr>
+      </w:pPr>
+      <w:r>
+        <w:rPr>
+          <w:rFonts w:asciiTheme="minorBidi" w:hAnsiTheme="minorBidi"/>
+        </w:rPr>
+        <w:drawing>
+          <wp:inline distT="0" distB="0" distL="0" distR="0" wp14:anchorId="3BCD23E2" wp14:editId="0900F745">
+            <wp:extent cx="5486400" cy="2598420"/>
+            <wp:effectExtent l="0" t="0" r="0" b="0"/>
+            <wp:docPr id="156165991" name="Picture 1"/>
+            <wp:cNvGraphicFramePr>
+              <a:graphicFrameLocks xmlns:a="http://schemas.openxmlformats.org/drawingml/2006/main" noChangeAspect="1"/>
+            </wp:cNvGraphicFramePr>
+            <a:graphic xmlns:a="http://schemas.openxmlformats.org/drawingml/2006/main">
+              <a:graphicData uri="http://schemas.openxmlformats.org/drawingml/2006/picture">
+                <pic:pic xmlns:pic="http://schemas.openxmlformats.org/drawingml/2006/picture">
+                  <pic:nvPicPr>
+                    <pic:cNvPr id="156165991" name=""/>
+                    <pic:cNvPicPr/>
+                  </pic:nvPicPr>
+                  <pic:blipFill>
+                    <a:blip r:embed="rId12"/>
+                    <a:stretch>
+                      <a:fillRect/>
+                    </a:stretch>
+                  </pic:blipFill>
+                  <pic:spPr>
+                    <a:xfrm>
+                      <a:off x="0" y="0"/>
+                      <a:ext cx="5486400" cy="2598420"/>
+                    </a:xfrm>
+                    <a:prstGeom prst="rect">
+                      <a:avLst/>
+                    </a:prstGeom>
+                  </pic:spPr>
+                </pic:pic>
+              </a:graphicData>
+            </a:graphic>
+          </wp:inline>
+        </w:drawing>
       </w:r>
     </w:p>
     <w:p>
       <w:pPr>
-        <w:pStyle w:val="ListBullet"/>
-        <w:rPr>
-          <w:rFonts w:asciiTheme="minorBidi" w:hAnsiTheme="minorBidi"/>
-        </w:rPr>
-      </w:pPr>
-      <w:r>
-        <w:rPr>
-          <w:rFonts w:asciiTheme="minorBidi" w:hAnsiTheme="minorBidi"/>
-        </w:rPr>
-        <w:lastRenderedPageBreak/>
-        <w:t>Handle invalid ranges (age, quantity, unit_price, discount_pct) and justify decisions</w:t>
+        <w:pStyle w:val="ListNumber"/>
+        <w:numPr>
+          <w:ilvl w:val="0"/>
+          <w:numId w:val="0"/>
+        </w:numPr>
+        <w:ind w:left="360"/>
+        <w:rPr>
+          <w:rFonts w:asciiTheme="minorBidi" w:hAnsiTheme="minorBidi"/>
+        </w:rPr>
+      </w:pPr>
+      <w:r>
+        <w:rPr>
+          <w:rFonts w:asciiTheme="minorBidi" w:hAnsiTheme="minorBidi"/>
+        </w:rPr>
+        <w:t xml:space="preserve"> </w:t>
       </w:r>
     </w:p>
     <w:p>
       <w:pPr>
-        <w:pStyle w:val="ListBullet"/>
-        <w:rPr>
-          <w:rFonts w:asciiTheme="minorBidi" w:hAnsiTheme="minorBidi"/>
-        </w:rPr>
-      </w:pPr>
-      <w:r>
-        <w:rPr>
-          <w:rFonts w:asciiTheme="minorBidi" w:hAnsiTheme="minorBidi"/>
-        </w:rPr>
-        <w:t>Produce a validation summary after cleaning</w:t>
+        <w:pStyle w:val="ListNumber"/>
+        <w:numPr>
+          <w:ilvl w:val="0"/>
+          <w:numId w:val="0"/>
+        </w:numPr>
+        <w:ind w:left="360"/>
+        <w:rPr>
+          <w:rFonts w:asciiTheme="minorBidi" w:hAnsiTheme="minorBidi"/>
+        </w:rPr>
+      </w:pPr>
+      <w:r>
+        <w:rPr>
+          <w:rFonts w:asciiTheme="minorBidi" w:hAnsiTheme="minorBidi"/>
+        </w:rPr>
+        <w:t xml:space="preserve"> </w:t>
       </w:r>
     </w:p>
     <w:p>
       <w:pPr>
-        <w:pStyle w:val="Heading3"/>
-        <w:rPr>
-          <w:rFonts w:asciiTheme="minorBidi" w:hAnsiTheme="minorBidi" w:cstheme="minorBidi"/>
-        </w:rPr>
-      </w:pPr>
-      <w:r>
-        <w:rPr>
-          <w:rFonts w:asciiTheme="minorBidi" w:hAnsiTheme="minorBidi" w:cstheme="minorBidi"/>
-        </w:rPr>
-        <w:t>Q3 (15 pts) — Feature Engineering (Pipeline Stage: TRANSFORM)</w:t>
+        <w:pStyle w:val="ListNumber"/>
+        <w:rPr>
+          <w:rFonts w:asciiTheme="minorBidi" w:hAnsiTheme="minorBidi"/>
+        </w:rPr>
+      </w:pPr>
+      <w:r>
+        <w:rPr>
+          <w:rFonts w:asciiTheme="minorBidi" w:hAnsiTheme="minorBidi"/>
+        </w:rPr>
+        <w:t>Which issues will break analysis versus only reduce accuracy?</w:t>
       </w:r>
     </w:p>
     <w:p>
       <w:pPr>
-        <w:rPr>
-          <w:rFonts w:asciiTheme="minorBidi" w:hAnsiTheme="minorBidi"/>
-        </w:rPr>
-      </w:pPr>
-      <w:r>
-        <w:rPr>
-          <w:rFonts w:asciiTheme="minorBidi" w:hAnsiTheme="minorBidi"/>
-        </w:rPr>
-        <w:t>Create derived fields for analysis:</w:t>
-      </w:r>
+        <w:pStyle w:val="ListNumber"/>
+        <w:numPr>
+          <w:ilvl w:val="0"/>
+          <w:numId w:val="0"/>
+        </w:numPr>
+        <w:ind w:left="360"/>
+        <w:rPr>
+          <w:rFonts w:asciiTheme="minorBidi" w:hAnsiTheme="minorBidi"/>
+        </w:rPr>
+      </w:pPr>
     </w:p>
     <w:p>
       <w:pPr>
-        <w:pStyle w:val="ListBullet"/>
-        <w:rPr>
-          <w:rFonts w:asciiTheme="minorBidi" w:hAnsiTheme="minorBidi"/>
-        </w:rPr>
-      </w:pPr>
-      <w:r>
-        <w:rPr>
-          <w:rFonts w:asciiTheme="minorBidi" w:hAnsiTheme="minorBidi"/>
-        </w:rPr>
-        <w:t>gross_revenue = quantity × unit_price</w:t>
+        <w:pStyle w:val="ListNumber"/>
+        <w:numPr>
+          <w:ilvl w:val="0"/>
+          <w:numId w:val="0"/>
+        </w:numPr>
+        <w:ind w:left="360" w:firstLine="360"/>
+        <w:rPr>
+          <w:rFonts w:asciiTheme="minorBidi" w:hAnsiTheme="minorBidi"/>
+        </w:rPr>
+      </w:pPr>
+      <w:r>
+        <w:rPr>
+          <w:rFonts w:asciiTheme="minorBidi" w:hAnsiTheme="minorBidi"/>
+        </w:rPr>
+        <w:t xml:space="preserve">Missing values in the age, </w:t>
+      </w:r>
+      <w:proofErr w:type="spellStart"/>
+      <w:r>
+        <w:rPr>
+          <w:rFonts w:asciiTheme="minorBidi" w:hAnsiTheme="minorBidi"/>
+        </w:rPr>
+        <w:t>income_usd</w:t>
+      </w:r>
+      <w:proofErr w:type="spellEnd"/>
+      <w:r>
+        <w:rPr>
+          <w:rFonts w:asciiTheme="minorBidi" w:hAnsiTheme="minorBidi"/>
+        </w:rPr>
+        <w:t xml:space="preserve">, </w:t>
+      </w:r>
+      <w:proofErr w:type="spellStart"/>
+      <w:r>
+        <w:rPr>
+          <w:rFonts w:asciiTheme="minorBidi" w:hAnsiTheme="minorBidi"/>
+        </w:rPr>
+        <w:t>unit_price_usd</w:t>
+      </w:r>
+      <w:proofErr w:type="spellEnd"/>
+      <w:r>
+        <w:rPr>
+          <w:rFonts w:asciiTheme="minorBidi" w:hAnsiTheme="minorBidi"/>
+        </w:rPr>
+        <w:t xml:space="preserve"> might mess with accuracy of the analysis.</w:t>
+      </w:r>
+      <w:r>
+        <w:rPr>
+          <w:rFonts w:asciiTheme="minorBidi" w:hAnsiTheme="minorBidi"/>
+        </w:rPr>
+        <w:t xml:space="preserve"> Also, the </w:t>
+      </w:r>
+      <w:proofErr w:type="spellStart"/>
+      <w:r>
+        <w:rPr>
+          <w:rFonts w:asciiTheme="minorBidi" w:hAnsiTheme="minorBidi"/>
+        </w:rPr>
+        <w:t>income_usd</w:t>
+      </w:r>
+      <w:proofErr w:type="spellEnd"/>
+      <w:r>
+        <w:rPr>
+          <w:rFonts w:asciiTheme="minorBidi" w:hAnsiTheme="minorBidi"/>
+        </w:rPr>
+        <w:t xml:space="preserve"> and </w:t>
+      </w:r>
+      <w:proofErr w:type="spellStart"/>
+      <w:r>
+        <w:rPr>
+          <w:rFonts w:asciiTheme="minorBidi" w:hAnsiTheme="minorBidi"/>
+        </w:rPr>
+        <w:t>unit_price_usd</w:t>
+      </w:r>
+      <w:proofErr w:type="spellEnd"/>
+      <w:r>
+        <w:rPr>
+          <w:rFonts w:asciiTheme="minorBidi" w:hAnsiTheme="minorBidi"/>
+        </w:rPr>
+        <w:t xml:space="preserve"> are object </w:t>
+      </w:r>
+      <w:proofErr w:type="gramStart"/>
+      <w:r>
+        <w:rPr>
+          <w:rFonts w:asciiTheme="minorBidi" w:hAnsiTheme="minorBidi"/>
+        </w:rPr>
+        <w:t>types</w:t>
+      </w:r>
+      <w:proofErr w:type="gramEnd"/>
+      <w:r>
+        <w:rPr>
+          <w:rFonts w:asciiTheme="minorBidi" w:hAnsiTheme="minorBidi"/>
+        </w:rPr>
+        <w:t xml:space="preserve"> not integer or float.</w:t>
+      </w:r>
+      <w:r>
+        <w:rPr>
+          <w:rFonts w:asciiTheme="minorBidi" w:hAnsiTheme="minorBidi"/>
+        </w:rPr>
+        <w:t xml:space="preserve"> The age column min value is </w:t>
+      </w:r>
+      <w:proofErr w:type="gramStart"/>
+      <w:r>
+        <w:rPr>
+          <w:rFonts w:asciiTheme="minorBidi" w:hAnsiTheme="minorBidi"/>
+        </w:rPr>
+        <w:t>negative</w:t>
+      </w:r>
+      <w:proofErr w:type="gramEnd"/>
+      <w:r>
+        <w:rPr>
+          <w:rFonts w:asciiTheme="minorBidi" w:hAnsiTheme="minorBidi"/>
+        </w:rPr>
+        <w:t xml:space="preserve"> and max value is too high.</w:t>
+      </w:r>
+      <w:r>
+        <w:rPr>
+          <w:rFonts w:asciiTheme="minorBidi" w:hAnsiTheme="minorBidi"/>
+        </w:rPr>
+        <w:t xml:space="preserve"> Order </w:t>
+      </w:r>
+      <w:proofErr w:type="gramStart"/>
+      <w:r>
+        <w:rPr>
+          <w:rFonts w:asciiTheme="minorBidi" w:hAnsiTheme="minorBidi"/>
+        </w:rPr>
+        <w:t>id  containing</w:t>
+      </w:r>
+      <w:proofErr w:type="gramEnd"/>
+      <w:r>
+        <w:rPr>
+          <w:rFonts w:asciiTheme="minorBidi" w:hAnsiTheme="minorBidi"/>
+        </w:rPr>
+        <w:t xml:space="preserve"> duplicate values, category column having inconsistent spacing/typos, quantity column may contain negative values, </w:t>
+      </w:r>
+      <w:proofErr w:type="spellStart"/>
+      <w:r>
+        <w:rPr>
+          <w:rFonts w:asciiTheme="minorBidi" w:hAnsiTheme="minorBidi"/>
+        </w:rPr>
+        <w:t>unit_price_usd</w:t>
+      </w:r>
+      <w:proofErr w:type="spellEnd"/>
+      <w:r>
+        <w:rPr>
+          <w:rFonts w:asciiTheme="minorBidi" w:hAnsiTheme="minorBidi"/>
+        </w:rPr>
+        <w:t xml:space="preserve"> containing negative values, and </w:t>
+      </w:r>
+      <w:proofErr w:type="spellStart"/>
+      <w:r>
+        <w:rPr>
+          <w:rFonts w:asciiTheme="minorBidi" w:hAnsiTheme="minorBidi"/>
+        </w:rPr>
+        <w:t>discount_pct</w:t>
+      </w:r>
+      <w:proofErr w:type="spellEnd"/>
+      <w:r>
+        <w:rPr>
+          <w:rFonts w:asciiTheme="minorBidi" w:hAnsiTheme="minorBidi"/>
+        </w:rPr>
+        <w:t xml:space="preserve"> may contain values greater than 100. </w:t>
       </w:r>
     </w:p>
     <w:p>
       <w:pPr>
-        <w:pStyle w:val="ListBullet"/>
-        <w:rPr>
-          <w:rFonts w:asciiTheme="minorBidi" w:hAnsiTheme="minorBidi"/>
-        </w:rPr>
-      </w:pPr>
-      <w:r>
-        <w:rPr>
-          <w:rFonts w:asciiTheme="minorBidi" w:hAnsiTheme="minorBidi"/>
-        </w:rPr>
-        <w:t>net_revenue = gross_revenue × (1 − discount_pct / 100)</w:t>
-      </w:r>
+        <w:pStyle w:val="ListNumber"/>
+        <w:numPr>
+          <w:ilvl w:val="0"/>
+          <w:numId w:val="0"/>
+        </w:numPr>
+        <w:ind w:left="360"/>
+        <w:rPr>
+          <w:rFonts w:asciiTheme="minorBidi" w:hAnsiTheme="minorBidi"/>
+        </w:rPr>
+      </w:pPr>
     </w:p>
     <w:p>
       <w:pPr>
-        <w:pStyle w:val="ListBullet"/>
-        <w:rPr>
-          <w:rFonts w:asciiTheme="minorBidi" w:hAnsiTheme="minorBidi"/>
-        </w:rPr>
-      </w:pPr>
-      <w:r>
-        <w:rPr>
-          <w:rFonts w:asciiTheme="minorBidi" w:hAnsiTheme="minorBidi"/>
-        </w:rPr>
-        <w:t>Optional: income_bucket or age_group (justify bin choices)</w:t>
+        <w:pStyle w:val="ListNumber"/>
+        <w:rPr>
+          <w:rFonts w:asciiTheme="minorBidi" w:hAnsiTheme="minorBidi"/>
+        </w:rPr>
+      </w:pPr>
+      <w:r>
+        <w:rPr>
+          <w:rFonts w:asciiTheme="minorBidi" w:hAnsiTheme="minorBidi"/>
+        </w:rPr>
+        <w:t>What is your step-by-step cleaning plan?</w:t>
       </w:r>
     </w:p>
     <w:p>
       <w:pPr>
-        <w:pStyle w:val="Heading3"/>
-        <w:rPr>
-          <w:rFonts w:asciiTheme="minorBidi" w:hAnsiTheme="minorBidi" w:cstheme="minorBidi"/>
-        </w:rPr>
-      </w:pPr>
-      <w:r>
-        <w:rPr>
-          <w:rFonts w:asciiTheme="minorBidi" w:hAnsiTheme="minorBidi" w:cstheme="minorBidi"/>
-        </w:rPr>
-        <w:t>Q4 (20 pts) — Chart Selection Challenge (Pipeline Stage: ENCODING and PERCEPTION)</w:t>
+        <w:pStyle w:val="ListNumber"/>
+        <w:numPr>
+          <w:ilvl w:val="0"/>
+          <w:numId w:val="0"/>
+        </w:numPr>
+        <w:ind w:left="360"/>
+        <w:rPr>
+          <w:rFonts w:asciiTheme="minorBidi" w:hAnsiTheme="minorBidi"/>
+        </w:rPr>
+      </w:pPr>
+      <w:r>
+        <w:rPr>
+          <w:rFonts w:asciiTheme="minorBidi" w:hAnsiTheme="minorBidi"/>
+        </w:rPr>
+        <w:t xml:space="preserve">Turn the </w:t>
+      </w:r>
+      <w:proofErr w:type="spellStart"/>
+      <w:r>
+        <w:rPr>
+          <w:rFonts w:asciiTheme="minorBidi" w:hAnsiTheme="minorBidi"/>
+        </w:rPr>
+        <w:t>income_usd</w:t>
+      </w:r>
+      <w:proofErr w:type="spellEnd"/>
+      <w:r>
+        <w:rPr>
+          <w:rFonts w:asciiTheme="minorBidi" w:hAnsiTheme="minorBidi"/>
+        </w:rPr>
+        <w:t xml:space="preserve"> and </w:t>
+      </w:r>
+      <w:proofErr w:type="spellStart"/>
+      <w:r>
+        <w:rPr>
+          <w:rFonts w:asciiTheme="minorBidi" w:hAnsiTheme="minorBidi"/>
+        </w:rPr>
+        <w:t>unit_price_usd</w:t>
+      </w:r>
+      <w:proofErr w:type="spellEnd"/>
+      <w:r>
+        <w:rPr>
+          <w:rFonts w:asciiTheme="minorBidi" w:hAnsiTheme="minorBidi"/>
+        </w:rPr>
+        <w:t xml:space="preserve"> columns into float type.:</w:t>
       </w:r>
     </w:p>
     <w:p>
       <w:pPr>
-        <w:rPr>
-          <w:rFonts w:asciiTheme="minorBidi" w:hAnsiTheme="minorBidi"/>
-        </w:rPr>
-      </w:pPr>
-      <w:r>
-        <w:rPr>
-          <w:rFonts w:asciiTheme="minorBidi" w:hAnsiTheme="minorBidi"/>
-        </w:rPr>
-        <w:t>Produce four visualizations. Choose appropriate chart types and justify your choices:</w:t>
+        <w:pStyle w:val="ListNumber"/>
+        <w:numPr>
+          <w:ilvl w:val="0"/>
+          <w:numId w:val="0"/>
+        </w:numPr>
+        <w:ind w:left="360"/>
+        <w:rPr>
+          <w:rFonts w:asciiTheme="minorBidi" w:hAnsiTheme="minorBidi"/>
+        </w:rPr>
+      </w:pPr>
+      <w:r>
+        <w:rPr>
+          <w:rFonts w:asciiTheme="minorBidi" w:hAnsiTheme="minorBidi"/>
+        </w:rPr>
+        <w:lastRenderedPageBreak/>
+        <w:drawing>
+          <wp:inline distT="0" distB="0" distL="0" distR="0" wp14:anchorId="2D99637C" wp14:editId="7ABB3C3D">
+            <wp:extent cx="5486400" cy="2277110"/>
+            <wp:effectExtent l="0" t="0" r="0" b="8890"/>
+            <wp:docPr id="349054863" name="Picture 1"/>
+            <wp:cNvGraphicFramePr>
+              <a:graphicFrameLocks xmlns:a="http://schemas.openxmlformats.org/drawingml/2006/main" noChangeAspect="1"/>
+            </wp:cNvGraphicFramePr>
+            <a:graphic xmlns:a="http://schemas.openxmlformats.org/drawingml/2006/main">
+              <a:graphicData uri="http://schemas.openxmlformats.org/drawingml/2006/picture">
+                <pic:pic xmlns:pic="http://schemas.openxmlformats.org/drawingml/2006/picture">
+                  <pic:nvPicPr>
+                    <pic:cNvPr id="349054863" name=""/>
+                    <pic:cNvPicPr/>
+                  </pic:nvPicPr>
+                  <pic:blipFill>
+                    <a:blip r:embed="rId13"/>
+                    <a:stretch>
+                      <a:fillRect/>
+                    </a:stretch>
+                  </pic:blipFill>
+                  <pic:spPr>
+                    <a:xfrm>
+                      <a:off x="0" y="0"/>
+                      <a:ext cx="5486400" cy="2277110"/>
+                    </a:xfrm>
+                    <a:prstGeom prst="rect">
+                      <a:avLst/>
+                    </a:prstGeom>
+                  </pic:spPr>
+                </pic:pic>
+              </a:graphicData>
+            </a:graphic>
+          </wp:inline>
+        </w:drawing>
       </w:r>
     </w:p>
     <w:p>
       <w:pPr>
         <w:pStyle w:val="ListNumber"/>
-        <w:rPr>
-          <w:rFonts w:asciiTheme="minorBidi" w:hAnsiTheme="minorBidi"/>
-        </w:rPr>
-      </w:pPr>
-      <w:r>
-        <w:rPr>
-          <w:rFonts w:asciiTheme="minorBidi" w:hAnsiTheme="minorBidi"/>
-        </w:rPr>
-        <w:t>Distribution of net_revenue (show skew; consider log scale)</w:t>
+        <w:numPr>
+          <w:ilvl w:val="0"/>
+          <w:numId w:val="0"/>
+        </w:numPr>
+        <w:ind w:left="360"/>
+        <w:rPr>
+          <w:rFonts w:asciiTheme="minorBidi" w:hAnsiTheme="minorBidi"/>
+        </w:rPr>
+      </w:pPr>
+      <w:r>
+        <w:rPr>
+          <w:rFonts w:asciiTheme="minorBidi" w:hAnsiTheme="minorBidi"/>
+        </w:rPr>
+        <w:drawing>
+          <wp:inline distT="0" distB="0" distL="0" distR="0" wp14:anchorId="75763842" wp14:editId="5E1FC263">
+            <wp:extent cx="5486400" cy="1784350"/>
+            <wp:effectExtent l="0" t="0" r="0" b="6350"/>
+            <wp:docPr id="935113673" name="Picture 1"/>
+            <wp:cNvGraphicFramePr>
+              <a:graphicFrameLocks xmlns:a="http://schemas.openxmlformats.org/drawingml/2006/main" noChangeAspect="1"/>
+            </wp:cNvGraphicFramePr>
+            <a:graphic xmlns:a="http://schemas.openxmlformats.org/drawingml/2006/main">
+              <a:graphicData uri="http://schemas.openxmlformats.org/drawingml/2006/picture">
+                <pic:pic xmlns:pic="http://schemas.openxmlformats.org/drawingml/2006/picture">
+                  <pic:nvPicPr>
+                    <pic:cNvPr id="935113673" name=""/>
+                    <pic:cNvPicPr/>
+                  </pic:nvPicPr>
+                  <pic:blipFill>
+                    <a:blip r:embed="rId14"/>
+                    <a:stretch>
+                      <a:fillRect/>
+                    </a:stretch>
+                  </pic:blipFill>
+                  <pic:spPr>
+                    <a:xfrm>
+                      <a:off x="0" y="0"/>
+                      <a:ext cx="5486400" cy="1784350"/>
+                    </a:xfrm>
+                    <a:prstGeom prst="rect">
+                      <a:avLst/>
+                    </a:prstGeom>
+                  </pic:spPr>
+                </pic:pic>
+              </a:graphicData>
+            </a:graphic>
+          </wp:inline>
+        </w:drawing>
       </w:r>
     </w:p>
     <w:p>
       <w:pPr>
         <w:pStyle w:val="ListNumber"/>
-        <w:rPr>
-          <w:rFonts w:asciiTheme="minorBidi" w:hAnsiTheme="minorBidi"/>
-        </w:rPr>
-      </w:pPr>
-      <w:r>
-        <w:rPr>
-          <w:rFonts w:asciiTheme="minorBidi" w:hAnsiTheme="minorBidi"/>
-        </w:rPr>
-        <w:t>Comparison of net_revenue across categories (show uncertainty or variability)</w:t>
+        <w:numPr>
+          <w:ilvl w:val="0"/>
+          <w:numId w:val="0"/>
+        </w:numPr>
+        <w:ind w:left="360"/>
+        <w:rPr>
+          <w:rFonts w:asciiTheme="minorBidi" w:hAnsiTheme="minorBidi"/>
+        </w:rPr>
+      </w:pPr>
+      <w:r>
+        <w:rPr>
+          <w:rFonts w:asciiTheme="minorBidi" w:hAnsiTheme="minorBidi"/>
+        </w:rPr>
+        <w:t xml:space="preserve">Replace missing values for age, </w:t>
+      </w:r>
+      <w:proofErr w:type="spellStart"/>
+      <w:r>
+        <w:rPr>
+          <w:rFonts w:asciiTheme="minorBidi" w:hAnsiTheme="minorBidi"/>
+        </w:rPr>
+        <w:t>income_usd</w:t>
+      </w:r>
+      <w:proofErr w:type="spellEnd"/>
+      <w:r>
+        <w:rPr>
+          <w:rFonts w:asciiTheme="minorBidi" w:hAnsiTheme="minorBidi"/>
+        </w:rPr>
+        <w:t xml:space="preserve">, and </w:t>
+      </w:r>
+      <w:proofErr w:type="spellStart"/>
+      <w:r>
+        <w:rPr>
+          <w:rFonts w:asciiTheme="minorBidi" w:hAnsiTheme="minorBidi"/>
+        </w:rPr>
+        <w:t>unit_price_usd</w:t>
+      </w:r>
+      <w:proofErr w:type="spellEnd"/>
+      <w:r>
+        <w:rPr>
+          <w:rFonts w:asciiTheme="minorBidi" w:hAnsiTheme="minorBidi"/>
+        </w:rPr>
+        <w:t xml:space="preserve"> with average value:</w:t>
       </w:r>
     </w:p>
     <w:p>
       <w:pPr>
         <w:pStyle w:val="ListNumber"/>
-        <w:rPr>
-          <w:rFonts w:asciiTheme="minorBidi" w:hAnsiTheme="minorBidi"/>
-        </w:rPr>
-      </w:pPr>
-      <w:r>
-        <w:rPr>
-          <w:rFonts w:asciiTheme="minorBidi" w:hAnsiTheme="minorBidi"/>
-        </w:rPr>
-        <w:t>Relationship between income_usd and net_revenue (remember: correlation does not imply causation)</w:t>
+        <w:numPr>
+          <w:ilvl w:val="0"/>
+          <w:numId w:val="0"/>
+        </w:numPr>
+        <w:ind w:left="360"/>
+        <w:rPr>
+          <w:rFonts w:asciiTheme="minorBidi" w:hAnsiTheme="minorBidi"/>
+        </w:rPr>
+      </w:pPr>
+      <w:r>
+        <w:rPr>
+          <w:rFonts w:asciiTheme="minorBidi" w:hAnsiTheme="minorBidi"/>
+        </w:rPr>
+        <w:drawing>
+          <wp:inline distT="0" distB="0" distL="0" distR="0" wp14:anchorId="6D226C5B" wp14:editId="25648DD4">
+            <wp:extent cx="5486400" cy="2510155"/>
+            <wp:effectExtent l="0" t="0" r="0" b="4445"/>
+            <wp:docPr id="1977682955" name="Picture 1"/>
+            <wp:cNvGraphicFramePr>
+              <a:graphicFrameLocks xmlns:a="http://schemas.openxmlformats.org/drawingml/2006/main" noChangeAspect="1"/>
+            </wp:cNvGraphicFramePr>
+            <a:graphic xmlns:a="http://schemas.openxmlformats.org/drawingml/2006/main">
+              <a:graphicData uri="http://schemas.openxmlformats.org/drawingml/2006/picture">
+                <pic:pic xmlns:pic="http://schemas.openxmlformats.org/drawingml/2006/picture">
+                  <pic:nvPicPr>
+                    <pic:cNvPr id="1977682955" name=""/>
+                    <pic:cNvPicPr/>
+                  </pic:nvPicPr>
+                  <pic:blipFill>
+                    <a:blip r:embed="rId15"/>
+                    <a:stretch>
+                      <a:fillRect/>
+                    </a:stretch>
+                  </pic:blipFill>
+                  <pic:spPr>
+                    <a:xfrm>
+                      <a:off x="0" y="0"/>
+                      <a:ext cx="5486400" cy="2510155"/>
+                    </a:xfrm>
+                    <a:prstGeom prst="rect">
+                      <a:avLst/>
+                    </a:prstGeom>
+                  </pic:spPr>
+                </pic:pic>
+              </a:graphicData>
+            </a:graphic>
+          </wp:inline>
+        </w:drawing>
       </w:r>
     </w:p>
     <w:p>
       <w:pPr>
         <w:pStyle w:val="ListNumber"/>
-        <w:rPr>
-          <w:rFonts w:asciiTheme="minorBidi" w:hAnsiTheme="minorBidi"/>
-        </w:rPr>
-      </w:pPr>
-      <w:r>
-        <w:rPr>
-          <w:rFonts w:asciiTheme="minorBidi" w:hAnsiTheme="minorBidi"/>
-        </w:rPr>
-        <w:t>One additional chart supporting a managerial question (your choice)</w:t>
+        <w:numPr>
+          <w:ilvl w:val="0"/>
+          <w:numId w:val="0"/>
+        </w:numPr>
+        <w:ind w:left="360"/>
+        <w:rPr>
+          <w:rFonts w:asciiTheme="minorBidi" w:hAnsiTheme="minorBidi"/>
+        </w:rPr>
+      </w:pPr>
+      <w:r>
+        <w:rPr>
+          <w:rFonts w:asciiTheme="minorBidi" w:hAnsiTheme="minorBidi"/>
+        </w:rPr>
+        <w:lastRenderedPageBreak/>
+        <w:drawing>
+          <wp:inline distT="0" distB="0" distL="0" distR="0" wp14:anchorId="07E29066" wp14:editId="28D6976C">
+            <wp:extent cx="5486400" cy="2797810"/>
+            <wp:effectExtent l="0" t="0" r="0" b="2540"/>
+            <wp:docPr id="669601585" name="Picture 1"/>
+            <wp:cNvGraphicFramePr>
+              <a:graphicFrameLocks xmlns:a="http://schemas.openxmlformats.org/drawingml/2006/main" noChangeAspect="1"/>
+            </wp:cNvGraphicFramePr>
+            <a:graphic xmlns:a="http://schemas.openxmlformats.org/drawingml/2006/main">
+              <a:graphicData uri="http://schemas.openxmlformats.org/drawingml/2006/picture">
+                <pic:pic xmlns:pic="http://schemas.openxmlformats.org/drawingml/2006/picture">
+                  <pic:nvPicPr>
+                    <pic:cNvPr id="669601585" name=""/>
+                    <pic:cNvPicPr/>
+                  </pic:nvPicPr>
+                  <pic:blipFill>
+                    <a:blip r:embed="rId16"/>
+                    <a:stretch>
+                      <a:fillRect/>
+                    </a:stretch>
+                  </pic:blipFill>
+                  <pic:spPr>
+                    <a:xfrm>
+                      <a:off x="0" y="0"/>
+                      <a:ext cx="5486400" cy="2797810"/>
+                    </a:xfrm>
+                    <a:prstGeom prst="rect">
+                      <a:avLst/>
+                    </a:prstGeom>
+                  </pic:spPr>
+                </pic:pic>
+              </a:graphicData>
+            </a:graphic>
+          </wp:inline>
+        </w:drawing>
       </w:r>
     </w:p>
     <w:p>
       <w:pPr>
-        <w:rPr>
-          <w:rFonts w:asciiTheme="minorBidi" w:hAnsiTheme="minorBidi"/>
-        </w:rPr>
-      </w:pPr>
-      <w:r>
-        <w:rPr>
-          <w:rFonts w:asciiTheme="minorBidi" w:hAnsiTheme="minorBidi"/>
-        </w:rPr>
-        <w:t>Under each plot, write:</w:t>
+        <w:pStyle w:val="ListNumber"/>
+        <w:numPr>
+          <w:ilvl w:val="0"/>
+          <w:numId w:val="0"/>
+        </w:numPr>
+        <w:ind w:left="360"/>
+        <w:rPr>
+          <w:rFonts w:asciiTheme="minorBidi" w:hAnsiTheme="minorBidi"/>
+        </w:rPr>
+      </w:pPr>
+      <w:r>
+        <w:rPr>
+          <w:rFonts w:asciiTheme="minorBidi" w:hAnsiTheme="minorBidi"/>
+        </w:rPr>
+        <w:t>Fix column values that are negative or exceed the limit:</w:t>
       </w:r>
     </w:p>
     <w:p>
       <w:pPr>
-        <w:pStyle w:val="ListBullet"/>
-        <w:rPr>
-          <w:rFonts w:asciiTheme="minorBidi" w:hAnsiTheme="minorBidi"/>
-        </w:rPr>
-      </w:pPr>
-      <w:r>
-        <w:rPr>
-          <w:rFonts w:asciiTheme="minorBidi" w:hAnsiTheme="minorBidi"/>
-        </w:rPr>
-        <w:t>Why this chart type fits the task</w:t>
+        <w:pStyle w:val="ListNumber"/>
+        <w:numPr>
+          <w:ilvl w:val="0"/>
+          <w:numId w:val="0"/>
+        </w:numPr>
+        <w:ind w:left="360"/>
+        <w:rPr>
+          <w:rFonts w:asciiTheme="minorBidi" w:hAnsiTheme="minorBidi"/>
+        </w:rPr>
+      </w:pPr>
+      <w:r>
+        <w:rPr>
+          <w:rFonts w:asciiTheme="minorBidi" w:hAnsiTheme="minorBidi"/>
+        </w:rPr>
+        <w:drawing>
+          <wp:inline distT="0" distB="0" distL="0" distR="0" wp14:anchorId="001C93AB" wp14:editId="694F460F">
+            <wp:extent cx="5486400" cy="2289175"/>
+            <wp:effectExtent l="0" t="0" r="0" b="0"/>
+            <wp:docPr id="263314074" name="Picture 1"/>
+            <wp:cNvGraphicFramePr>
+              <a:graphicFrameLocks xmlns:a="http://schemas.openxmlformats.org/drawingml/2006/main" noChangeAspect="1"/>
+            </wp:cNvGraphicFramePr>
+            <a:graphic xmlns:a="http://schemas.openxmlformats.org/drawingml/2006/main">
+              <a:graphicData uri="http://schemas.openxmlformats.org/drawingml/2006/picture">
+                <pic:pic xmlns:pic="http://schemas.openxmlformats.org/drawingml/2006/picture">
+                  <pic:nvPicPr>
+                    <pic:cNvPr id="263314074" name=""/>
+                    <pic:cNvPicPr/>
+                  </pic:nvPicPr>
+                  <pic:blipFill>
+                    <a:blip r:embed="rId17"/>
+                    <a:stretch>
+                      <a:fillRect/>
+                    </a:stretch>
+                  </pic:blipFill>
+                  <pic:spPr>
+                    <a:xfrm>
+                      <a:off x="0" y="0"/>
+                      <a:ext cx="5486400" cy="2289175"/>
+                    </a:xfrm>
+                    <a:prstGeom prst="rect">
+                      <a:avLst/>
+                    </a:prstGeom>
+                  </pic:spPr>
+                </pic:pic>
+              </a:graphicData>
+            </a:graphic>
+          </wp:inline>
+        </w:drawing>
       </w:r>
     </w:p>
     <w:p>
       <w:pPr>
-        <w:pStyle w:val="ListBullet"/>
-        <w:rPr>
-          <w:rFonts w:asciiTheme="minorBidi" w:hAnsiTheme="minorBidi"/>
-        </w:rPr>
-      </w:pPr>
-      <w:r>
-        <w:rPr>
-          <w:rFonts w:asciiTheme="minorBidi" w:hAnsiTheme="minorBidi"/>
-        </w:rPr>
-        <w:t>One perceptual risk and how you reduced it</w:t>
+        <w:pStyle w:val="ListNumber"/>
+        <w:numPr>
+          <w:ilvl w:val="0"/>
+          <w:numId w:val="0"/>
+        </w:numPr>
+        <w:ind w:left="360"/>
+        <w:rPr>
+          <w:rFonts w:asciiTheme="minorBidi" w:hAnsiTheme="minorBidi"/>
+        </w:rPr>
+      </w:pPr>
+      <w:r>
+        <w:rPr>
+          <w:rFonts w:asciiTheme="minorBidi" w:hAnsiTheme="minorBidi"/>
+        </w:rPr>
+        <w:t>Fix typos and trim spacing for the ‘category’ column:</w:t>
       </w:r>
     </w:p>
     <w:p>
       <w:pPr>
-        <w:pStyle w:val="Heading3"/>
-        <w:rPr>
-          <w:rFonts w:asciiTheme="minorBidi" w:hAnsiTheme="minorBidi" w:cstheme="minorBidi"/>
-        </w:rPr>
-      </w:pPr>
-      <w:r>
-        <w:rPr>
-          <w:rFonts w:asciiTheme="minorBidi" w:hAnsiTheme="minorBidi" w:cstheme="minorBidi"/>
-        </w:rPr>
-        <w:t>Q5 (15 pts) — Decision-Ready Visualization (Pipeline Stage: INTERPRETATION)</w:t>
+        <w:pStyle w:val="ListNumber"/>
+        <w:numPr>
+          <w:ilvl w:val="0"/>
+          <w:numId w:val="0"/>
+        </w:numPr>
+        <w:ind w:left="360"/>
+        <w:rPr>
+          <w:rFonts w:asciiTheme="minorBidi" w:hAnsiTheme="minorBidi"/>
+        </w:rPr>
+      </w:pPr>
+      <w:r>
+        <w:rPr>
+          <w:rFonts w:asciiTheme="minorBidi" w:hAnsiTheme="minorBidi"/>
+        </w:rPr>
+        <w:drawing>
+          <wp:inline distT="0" distB="0" distL="0" distR="0" wp14:anchorId="20B7FAA3" wp14:editId="2CBBE99D">
+            <wp:extent cx="5486400" cy="2200910"/>
+            <wp:effectExtent l="0" t="0" r="0" b="8890"/>
+            <wp:docPr id="1835342245" name="Picture 1"/>
+            <wp:cNvGraphicFramePr>
+              <a:graphicFrameLocks xmlns:a="http://schemas.openxmlformats.org/drawingml/2006/main" noChangeAspect="1"/>
+            </wp:cNvGraphicFramePr>
+            <a:graphic xmlns:a="http://schemas.openxmlformats.org/drawingml/2006/main">
+              <a:graphicData uri="http://schemas.openxmlformats.org/drawingml/2006/picture">
+                <pic:pic xmlns:pic="http://schemas.openxmlformats.org/drawingml/2006/picture">
+                  <pic:nvPicPr>
+                    <pic:cNvPr id="1835342245" name=""/>
+                    <pic:cNvPicPr/>
+                  </pic:nvPicPr>
+                  <pic:blipFill>
+                    <a:blip r:embed="rId18"/>
+                    <a:stretch>
+                      <a:fillRect/>
+                    </a:stretch>
+                  </pic:blipFill>
+                  <pic:spPr>
+                    <a:xfrm>
+                      <a:off x="0" y="0"/>
+                      <a:ext cx="5486400" cy="2200910"/>
+                    </a:xfrm>
+                    <a:prstGeom prst="rect">
+                      <a:avLst/>
+                    </a:prstGeom>
+                  </pic:spPr>
+                </pic:pic>
+              </a:graphicData>
+            </a:graphic>
+          </wp:inline>
+        </w:drawing>
       </w:r>
     </w:p>
     <w:p>
       <w:pPr>
-        <w:rPr>
-          <w:rFonts w:asciiTheme="minorBidi" w:hAnsiTheme="minorBidi"/>
-        </w:rPr>
-      </w:pPr>
-      <w:r>
-        <w:rPr>
-          <w:rFonts w:asciiTheme="minorBidi" w:hAnsiTheme="minorBidi"/>
-        </w:rPr>
-        <w:t>Create one final visualization that includes:</w:t>
+        <w:pStyle w:val="ListNumber"/>
+        <w:numPr>
+          <w:ilvl w:val="0"/>
+          <w:numId w:val="0"/>
+        </w:numPr>
+        <w:ind w:left="360"/>
+        <w:rPr>
+          <w:rFonts w:asciiTheme="minorBidi" w:hAnsiTheme="minorBidi"/>
+        </w:rPr>
+      </w:pPr>
+      <w:r>
+        <w:rPr>
+          <w:rFonts w:asciiTheme="minorBidi" w:hAnsiTheme="minorBidi"/>
+        </w:rPr>
+        <w:t>Remove Duplicated values from the ‘</w:t>
+      </w:r>
+      <w:proofErr w:type="spellStart"/>
+      <w:r>
+        <w:rPr>
+          <w:rFonts w:asciiTheme="minorBidi" w:hAnsiTheme="minorBidi"/>
+        </w:rPr>
+        <w:t>order_id</w:t>
+      </w:r>
+      <w:proofErr w:type="spellEnd"/>
+      <w:r>
+        <w:rPr>
+          <w:rFonts w:asciiTheme="minorBidi" w:hAnsiTheme="minorBidi"/>
+        </w:rPr>
+        <w:t>’ column:</w:t>
       </w:r>
     </w:p>
     <w:p>
       <w:pPr>
-        <w:pStyle w:val="ListBullet"/>
-        <w:rPr>
-          <w:rFonts w:asciiTheme="minorBidi" w:hAnsiTheme="minorBidi"/>
-        </w:rPr>
-      </w:pPr>
-      <w:r>
-        <w:rPr>
-          <w:rFonts w:asciiTheme="minorBidi" w:hAnsiTheme="minorBidi"/>
-        </w:rPr>
-        <w:t>A message-driven title stating the conclusion</w:t>
+        <w:pStyle w:val="ListNumber"/>
+        <w:numPr>
+          <w:ilvl w:val="0"/>
+          <w:numId w:val="0"/>
+        </w:numPr>
+        <w:ind w:left="360"/>
+        <w:rPr>
+          <w:rFonts w:asciiTheme="minorBidi" w:hAnsiTheme="minorBidi"/>
+        </w:rPr>
+      </w:pPr>
+      <w:r>
+        <w:rPr>
+          <w:rFonts w:asciiTheme="minorBidi" w:hAnsiTheme="minorBidi"/>
+        </w:rPr>
+        <w:lastRenderedPageBreak/>
+        <w:drawing>
+          <wp:inline distT="0" distB="0" distL="0" distR="0" wp14:anchorId="30189E97" wp14:editId="384FA3AF">
+            <wp:extent cx="5486400" cy="2679700"/>
+            <wp:effectExtent l="0" t="0" r="0" b="6350"/>
+            <wp:docPr id="235897400" name="Picture 1"/>
+            <wp:cNvGraphicFramePr>
+              <a:graphicFrameLocks xmlns:a="http://schemas.openxmlformats.org/drawingml/2006/main" noChangeAspect="1"/>
+            </wp:cNvGraphicFramePr>
+            <a:graphic xmlns:a="http://schemas.openxmlformats.org/drawingml/2006/main">
+              <a:graphicData uri="http://schemas.openxmlformats.org/drawingml/2006/picture">
+                <pic:pic xmlns:pic="http://schemas.openxmlformats.org/drawingml/2006/picture">
+                  <pic:nvPicPr>
+                    <pic:cNvPr id="235897400" name=""/>
+                    <pic:cNvPicPr/>
+                  </pic:nvPicPr>
+                  <pic:blipFill>
+                    <a:blip r:embed="rId19"/>
+                    <a:stretch>
+                      <a:fillRect/>
+                    </a:stretch>
+                  </pic:blipFill>
+                  <pic:spPr>
+                    <a:xfrm>
+                      <a:off x="0" y="0"/>
+                      <a:ext cx="5486400" cy="2679700"/>
+                    </a:xfrm>
+                    <a:prstGeom prst="rect">
+                      <a:avLst/>
+                    </a:prstGeom>
+                  </pic:spPr>
+                </pic:pic>
+              </a:graphicData>
+            </a:graphic>
+          </wp:inline>
+        </w:drawing>
+      </w:r>
+      <w:r>
+        <w:rPr>
+          <w:rFonts w:asciiTheme="minorBidi" w:hAnsiTheme="minorBidi"/>
+        </w:rPr>
+        <w:t xml:space="preserve"> Summary of statistics:</w:t>
       </w:r>
     </w:p>
     <w:p>
       <w:pPr>
-        <w:pStyle w:val="ListBullet"/>
-        <w:rPr>
-          <w:rFonts w:asciiTheme="minorBidi" w:hAnsiTheme="minorBidi"/>
-        </w:rPr>
-      </w:pPr>
-      <w:r>
-        <w:rPr>
-          <w:rFonts w:asciiTheme="minorBidi" w:hAnsiTheme="minorBidi"/>
-        </w:rPr>
-        <w:t>Clear axis labels</w:t>
+        <w:pStyle w:val="ListNumber"/>
+        <w:numPr>
+          <w:ilvl w:val="0"/>
+          <w:numId w:val="0"/>
+        </w:numPr>
+        <w:ind w:left="360"/>
+        <w:rPr>
+          <w:rFonts w:asciiTheme="minorBidi" w:hAnsiTheme="minorBidi"/>
+        </w:rPr>
+      </w:pPr>
+      <w:r>
+        <w:rPr>
+          <w:rFonts w:asciiTheme="minorBidi" w:hAnsiTheme="minorBidi"/>
+        </w:rPr>
+        <w:drawing>
+          <wp:inline distT="0" distB="0" distL="0" distR="0" wp14:anchorId="108F0BAE" wp14:editId="3BF13133">
+            <wp:extent cx="5486400" cy="1469390"/>
+            <wp:effectExtent l="0" t="0" r="0" b="0"/>
+            <wp:docPr id="1687235369" name="Picture 1"/>
+            <wp:cNvGraphicFramePr>
+              <a:graphicFrameLocks xmlns:a="http://schemas.openxmlformats.org/drawingml/2006/main" noChangeAspect="1"/>
+            </wp:cNvGraphicFramePr>
+            <a:graphic xmlns:a="http://schemas.openxmlformats.org/drawingml/2006/main">
+              <a:graphicData uri="http://schemas.openxmlformats.org/drawingml/2006/picture">
+                <pic:pic xmlns:pic="http://schemas.openxmlformats.org/drawingml/2006/picture">
+                  <pic:nvPicPr>
+                    <pic:cNvPr id="1687235369" name=""/>
+                    <pic:cNvPicPr/>
+                  </pic:nvPicPr>
+                  <pic:blipFill>
+                    <a:blip r:embed="rId20"/>
+                    <a:stretch>
+                      <a:fillRect/>
+                    </a:stretch>
+                  </pic:blipFill>
+                  <pic:spPr>
+                    <a:xfrm>
+                      <a:off x="0" y="0"/>
+                      <a:ext cx="5486400" cy="1469390"/>
+                    </a:xfrm>
+                    <a:prstGeom prst="rect">
+                      <a:avLst/>
+                    </a:prstGeom>
+                  </pic:spPr>
+                </pic:pic>
+              </a:graphicData>
+            </a:graphic>
+          </wp:inline>
+        </w:drawing>
+      </w:r>
+      <w:r>
+        <w:rPr>
+          <w:rFonts w:asciiTheme="minorBidi" w:hAnsiTheme="minorBidi"/>
+        </w:rPr>
+        <w:t xml:space="preserve"> </w:t>
       </w:r>
     </w:p>
     <w:p>
       <w:pPr>
-        <w:pStyle w:val="ListBullet"/>
-        <w:rPr>
-          <w:rFonts w:asciiTheme="minorBidi" w:hAnsiTheme="minorBidi"/>
-        </w:rPr>
-      </w:pPr>
-      <w:r>
-        <w:rPr>
-          <w:rFonts w:asciiTheme="minorBidi" w:hAnsiTheme="minorBidi"/>
-        </w:rPr>
-        <w:t>A short annotation highlighting key evidence</w:t>
+        <w:pStyle w:val="Heading3"/>
+        <w:rPr>
+          <w:rFonts w:asciiTheme="minorBidi" w:hAnsiTheme="minorBidi" w:cstheme="minorBidi"/>
+        </w:rPr>
+      </w:pPr>
+      <w:r>
+        <w:rPr>
+          <w:rFonts w:asciiTheme="minorBidi" w:hAnsiTheme="minorBidi" w:cstheme="minorBidi"/>
+        </w:rPr>
+        <w:t xml:space="preserve">Q2 (25 </w:t>
+      </w:r>
+      <w:proofErr w:type="gramStart"/>
+      <w:r>
+        <w:rPr>
+          <w:rFonts w:asciiTheme="minorBidi" w:hAnsiTheme="minorBidi" w:cstheme="minorBidi"/>
+        </w:rPr>
+        <w:t>pts) —</w:t>
+      </w:r>
+      <w:proofErr w:type="gramEnd"/>
+      <w:r>
+        <w:rPr>
+          <w:rFonts w:asciiTheme="minorBidi" w:hAnsiTheme="minorBidi" w:cstheme="minorBidi"/>
+        </w:rPr>
+        <w:t xml:space="preserve"> Cleaning and Validation (Pipeline Stage: TRANSFORM)</w:t>
       </w:r>
     </w:p>
     <w:p>
@@ -719,7 +1528,7 @@
         <w:rPr>
           <w:rFonts w:asciiTheme="minorBidi" w:hAnsiTheme="minorBidi"/>
         </w:rPr>
-        <w:t>Write 150–250 words addressing:</w:t>
+        <w:t>Create a cleaned DataFrame named df and validate it. Minimum requirements:</w:t>
       </w:r>
     </w:p>
     <w:p>
@@ -733,7 +1542,7 @@
         <w:rPr>
           <w:rFonts w:asciiTheme="minorBidi" w:hAnsiTheme="minorBidi"/>
         </w:rPr>
-        <w:t>What decision could this visualization support?</w:t>
+        <w:t>Convert numeric columns to numeric types (handle $, commas, and blanks)</w:t>
       </w:r>
     </w:p>
     <w:p>
@@ -747,21 +1556,21 @@
         <w:rPr>
           <w:rFonts w:asciiTheme="minorBidi" w:hAnsiTheme="minorBidi"/>
         </w:rPr>
-        <w:t>What uncertainty or risk remains?</w:t>
+        <w:t>Standardize category values (trim spaces, standardize case, correct obvious typos)</w:t>
       </w:r>
     </w:p>
     <w:p>
       <w:pPr>
-        <w:pStyle w:val="Heading3"/>
-        <w:rPr>
-          <w:rFonts w:asciiTheme="minorBidi" w:hAnsiTheme="minorBidi" w:cstheme="minorBidi"/>
-        </w:rPr>
-      </w:pPr>
-      <w:r>
-        <w:rPr>
-          <w:rFonts w:asciiTheme="minorBidi" w:hAnsiTheme="minorBidi" w:cstheme="minorBidi"/>
-        </w:rPr>
-        <w:t>Q6 (10 pts) — Reflection</w:t>
+        <w:pStyle w:val="ListBullet"/>
+        <w:rPr>
+          <w:rFonts w:asciiTheme="minorBidi" w:hAnsiTheme="minorBidi"/>
+        </w:rPr>
+      </w:pPr>
+      <w:r>
+        <w:rPr>
+          <w:rFonts w:asciiTheme="minorBidi" w:hAnsiTheme="minorBidi"/>
+        </w:rPr>
+        <w:t>Handle duplicates (define and apply a rule)</w:t>
       </w:r>
     </w:p>
     <w:p>
@@ -775,7 +1584,7 @@
         <w:rPr>
           <w:rFonts w:asciiTheme="minorBidi" w:hAnsiTheme="minorBidi"/>
         </w:rPr>
-        <w:t>Which pipeline stage was the most challenging and why?</w:t>
+        <w:t>Handle missing values (justify your approach)</w:t>
       </w:r>
     </w:p>
     <w:p>
@@ -789,16 +1598,1380 @@
         <w:rPr>
           <w:rFonts w:asciiTheme="minorBidi" w:hAnsiTheme="minorBidi"/>
         </w:rPr>
+        <w:t>Handle invalid ranges (age, quantity, unit_price, discount_pct) and justify decisions</w:t>
+      </w:r>
+    </w:p>
+    <w:p>
+      <w:pPr>
+        <w:pStyle w:val="ListBullet"/>
+        <w:rPr>
+          <w:rFonts w:asciiTheme="minorBidi" w:hAnsiTheme="minorBidi"/>
+        </w:rPr>
+      </w:pPr>
+      <w:r>
+        <w:rPr>
+          <w:rFonts w:asciiTheme="minorBidi" w:hAnsiTheme="minorBidi"/>
+        </w:rPr>
+        <w:t>Produce a validation summary after cleaning</w:t>
+      </w:r>
+    </w:p>
+    <w:p>
+      <w:pPr>
+        <w:pStyle w:val="Heading3"/>
+        <w:rPr>
+          <w:rFonts w:asciiTheme="minorBidi" w:hAnsiTheme="minorBidi" w:cstheme="minorBidi"/>
+        </w:rPr>
+      </w:pPr>
+      <w:r>
+        <w:rPr>
+          <w:rFonts w:asciiTheme="minorBidi" w:hAnsiTheme="minorBidi" w:cstheme="minorBidi"/>
+        </w:rPr>
+        <w:t>Q3 (15 pts) — Feature Engineering (Pipeline Stage: TRANSFORM)</w:t>
+      </w:r>
+    </w:p>
+    <w:p>
+      <w:pPr>
+        <w:rPr>
+          <w:rFonts w:asciiTheme="minorBidi" w:hAnsiTheme="minorBidi"/>
+        </w:rPr>
+      </w:pPr>
+      <w:r>
+        <w:rPr>
+          <w:rFonts w:asciiTheme="minorBidi" w:hAnsiTheme="minorBidi"/>
+        </w:rPr>
+        <w:t>Create derived fields for analysis:</w:t>
+      </w:r>
+    </w:p>
+    <w:p>
+      <w:pPr>
+        <w:pStyle w:val="ListBullet"/>
+        <w:rPr>
+          <w:rFonts w:asciiTheme="minorBidi" w:hAnsiTheme="minorBidi"/>
+        </w:rPr>
+      </w:pPr>
+      <w:r>
+        <w:rPr>
+          <w:rFonts w:asciiTheme="minorBidi" w:hAnsiTheme="minorBidi"/>
+        </w:rPr>
+        <w:t xml:space="preserve">gross_revenue = quantity × </w:t>
+      </w:r>
+      <w:proofErr w:type="spellStart"/>
+      <w:r>
+        <w:rPr>
+          <w:rFonts w:asciiTheme="minorBidi" w:hAnsiTheme="minorBidi"/>
+        </w:rPr>
+        <w:t>unit_price</w:t>
+      </w:r>
+      <w:proofErr w:type="spellEnd"/>
+    </w:p>
+    <w:p>
+      <w:pPr>
+        <w:pStyle w:val="ListBullet"/>
+        <w:numPr>
+          <w:ilvl w:val="0"/>
+          <w:numId w:val="0"/>
+        </w:numPr>
+        <w:ind w:left="360"/>
+        <w:rPr>
+          <w:rFonts w:asciiTheme="minorBidi" w:hAnsiTheme="minorBidi"/>
+        </w:rPr>
+      </w:pPr>
+      <w:r>
+        <w:rPr>
+          <w:rFonts w:asciiTheme="minorBidi" w:hAnsiTheme="minorBidi"/>
+        </w:rPr>
+        <w:lastRenderedPageBreak/>
+        <w:drawing>
+          <wp:inline distT="0" distB="0" distL="0" distR="0" wp14:anchorId="6A2513D3" wp14:editId="514B78FD">
+            <wp:extent cx="5486400" cy="2223135"/>
+            <wp:effectExtent l="0" t="0" r="0" b="5715"/>
+            <wp:docPr id="1598569521" name="Picture 1"/>
+            <wp:cNvGraphicFramePr>
+              <a:graphicFrameLocks xmlns:a="http://schemas.openxmlformats.org/drawingml/2006/main" noChangeAspect="1"/>
+            </wp:cNvGraphicFramePr>
+            <a:graphic xmlns:a="http://schemas.openxmlformats.org/drawingml/2006/main">
+              <a:graphicData uri="http://schemas.openxmlformats.org/drawingml/2006/picture">
+                <pic:pic xmlns:pic="http://schemas.openxmlformats.org/drawingml/2006/picture">
+                  <pic:nvPicPr>
+                    <pic:cNvPr id="1598569521" name=""/>
+                    <pic:cNvPicPr/>
+                  </pic:nvPicPr>
+                  <pic:blipFill>
+                    <a:blip r:embed="rId21"/>
+                    <a:stretch>
+                      <a:fillRect/>
+                    </a:stretch>
+                  </pic:blipFill>
+                  <pic:spPr>
+                    <a:xfrm>
+                      <a:off x="0" y="0"/>
+                      <a:ext cx="5486400" cy="2223135"/>
+                    </a:xfrm>
+                    <a:prstGeom prst="rect">
+                      <a:avLst/>
+                    </a:prstGeom>
+                  </pic:spPr>
+                </pic:pic>
+              </a:graphicData>
+            </a:graphic>
+          </wp:inline>
+        </w:drawing>
+      </w:r>
+      <w:r>
+        <w:rPr>
+          <w:rFonts w:asciiTheme="minorBidi" w:hAnsiTheme="minorBidi"/>
+        </w:rPr>
+        <w:t xml:space="preserve"> </w:t>
+      </w:r>
+    </w:p>
+    <w:p>
+      <w:pPr>
+        <w:pStyle w:val="ListBullet"/>
+        <w:rPr>
+          <w:rFonts w:asciiTheme="minorBidi" w:hAnsiTheme="minorBidi"/>
+        </w:rPr>
+      </w:pPr>
+      <w:r>
+        <w:rPr>
+          <w:rFonts w:asciiTheme="minorBidi" w:hAnsiTheme="minorBidi"/>
+        </w:rPr>
+        <w:t>net_revenue = gross_revenue × (1 − discount_pct / 100)</w:t>
+      </w:r>
+    </w:p>
+    <w:p>
+      <w:pPr>
+        <w:pStyle w:val="ListBullet"/>
+        <w:numPr>
+          <w:ilvl w:val="0"/>
+          <w:numId w:val="0"/>
+        </w:numPr>
+        <w:ind w:left="360"/>
+        <w:rPr>
+          <w:rFonts w:asciiTheme="minorBidi" w:hAnsiTheme="minorBidi"/>
+        </w:rPr>
+      </w:pPr>
+      <w:r>
+        <w:rPr>
+          <w:rFonts w:asciiTheme="minorBidi" w:hAnsiTheme="minorBidi"/>
+        </w:rPr>
+        <w:drawing>
+          <wp:inline distT="0" distB="0" distL="0" distR="0" wp14:anchorId="7E45B82C" wp14:editId="3D65DB4C">
+            <wp:extent cx="5486400" cy="2244090"/>
+            <wp:effectExtent l="0" t="0" r="0" b="3810"/>
+            <wp:docPr id="1014652699" name="Picture 1"/>
+            <wp:cNvGraphicFramePr>
+              <a:graphicFrameLocks xmlns:a="http://schemas.openxmlformats.org/drawingml/2006/main" noChangeAspect="1"/>
+            </wp:cNvGraphicFramePr>
+            <a:graphic xmlns:a="http://schemas.openxmlformats.org/drawingml/2006/main">
+              <a:graphicData uri="http://schemas.openxmlformats.org/drawingml/2006/picture">
+                <pic:pic xmlns:pic="http://schemas.openxmlformats.org/drawingml/2006/picture">
+                  <pic:nvPicPr>
+                    <pic:cNvPr id="1014652699" name=""/>
+                    <pic:cNvPicPr/>
+                  </pic:nvPicPr>
+                  <pic:blipFill>
+                    <a:blip r:embed="rId22"/>
+                    <a:stretch>
+                      <a:fillRect/>
+                    </a:stretch>
+                  </pic:blipFill>
+                  <pic:spPr>
+                    <a:xfrm>
+                      <a:off x="0" y="0"/>
+                      <a:ext cx="5486400" cy="2244090"/>
+                    </a:xfrm>
+                    <a:prstGeom prst="rect">
+                      <a:avLst/>
+                    </a:prstGeom>
+                  </pic:spPr>
+                </pic:pic>
+              </a:graphicData>
+            </a:graphic>
+          </wp:inline>
+        </w:drawing>
+      </w:r>
+      <w:r>
+        <w:rPr>
+          <w:rFonts w:asciiTheme="minorBidi" w:hAnsiTheme="minorBidi"/>
+        </w:rPr>
+        <w:t xml:space="preserve"> </w:t>
+      </w:r>
+    </w:p>
+    <w:p>
+      <w:pPr>
+        <w:pStyle w:val="ListBullet"/>
+        <w:rPr>
+          <w:rFonts w:asciiTheme="minorBidi" w:hAnsiTheme="minorBidi"/>
+        </w:rPr>
+      </w:pPr>
+      <w:r>
+        <w:rPr>
+          <w:rFonts w:asciiTheme="minorBidi" w:hAnsiTheme="minorBidi"/>
+        </w:rPr>
+        <w:t>Optional: income_bucket or age_group (justify bin choices)</w:t>
+      </w:r>
+      <w:r>
+        <w:rPr>
+          <w:rFonts w:asciiTheme="minorBidi" w:hAnsiTheme="minorBidi"/>
+        </w:rPr>
+        <w:t xml:space="preserve"> </w:t>
+      </w:r>
+    </w:p>
+    <w:p>
+      <w:pPr>
+        <w:pStyle w:val="ListBullet"/>
+        <w:numPr>
+          <w:ilvl w:val="0"/>
+          <w:numId w:val="0"/>
+        </w:numPr>
+        <w:ind w:left="360"/>
+        <w:rPr>
+          <w:rFonts w:asciiTheme="minorBidi" w:hAnsiTheme="minorBidi"/>
+        </w:rPr>
+      </w:pPr>
+    </w:p>
+    <w:p>
+      <w:pPr>
+        <w:pStyle w:val="Heading3"/>
+        <w:rPr>
+          <w:rFonts w:asciiTheme="minorBidi" w:hAnsiTheme="minorBidi" w:cstheme="minorBidi"/>
+        </w:rPr>
+      </w:pPr>
+      <w:r>
+        <w:rPr>
+          <w:rFonts w:asciiTheme="minorBidi" w:hAnsiTheme="minorBidi" w:cstheme="minorBidi"/>
+        </w:rPr>
+        <w:t xml:space="preserve">Q4 (20 </w:t>
+      </w:r>
+      <w:proofErr w:type="gramStart"/>
+      <w:r>
+        <w:rPr>
+          <w:rFonts w:asciiTheme="minorBidi" w:hAnsiTheme="minorBidi" w:cstheme="minorBidi"/>
+        </w:rPr>
+        <w:t>pts) —</w:t>
+      </w:r>
+      <w:proofErr w:type="gramEnd"/>
+      <w:r>
+        <w:rPr>
+          <w:rFonts w:asciiTheme="minorBidi" w:hAnsiTheme="minorBidi" w:cstheme="minorBidi"/>
+        </w:rPr>
+        <w:t xml:space="preserve"> Chart Selection Challenge (Pipeline Stage: ENCODING and PERCEPTION)</w:t>
+      </w:r>
+    </w:p>
+    <w:p>
+      <w:pPr>
+        <w:rPr>
+          <w:rFonts w:asciiTheme="minorBidi" w:hAnsiTheme="minorBidi"/>
+        </w:rPr>
+      </w:pPr>
+      <w:r>
+        <w:rPr>
+          <w:rFonts w:asciiTheme="minorBidi" w:hAnsiTheme="minorBidi"/>
+        </w:rPr>
+        <w:t>Produce four visualizations. Choose appropriate chart types and justify your choices:</w:t>
+      </w:r>
+    </w:p>
+    <w:p>
+      <w:pPr>
+        <w:pStyle w:val="ListNumber"/>
+        <w:rPr>
+          <w:rFonts w:asciiTheme="minorBidi" w:hAnsiTheme="minorBidi"/>
+        </w:rPr>
+      </w:pPr>
+      <w:r>
+        <w:rPr>
+          <w:rFonts w:asciiTheme="minorBidi" w:hAnsiTheme="minorBidi"/>
+        </w:rPr>
+        <w:t>Distribution of net_revenue (show skew; consider log scale)</w:t>
+      </w:r>
+    </w:p>
+    <w:p>
+      <w:pPr>
+        <w:pStyle w:val="ListNumber"/>
+        <w:numPr>
+          <w:ilvl w:val="0"/>
+          <w:numId w:val="0"/>
+        </w:numPr>
+        <w:ind w:left="360"/>
+        <w:rPr>
+          <w:rFonts w:asciiTheme="minorBidi" w:hAnsiTheme="minorBidi"/>
+        </w:rPr>
+      </w:pPr>
+      <w:r>
+        <w:rPr>
+          <w:rFonts w:asciiTheme="minorBidi" w:hAnsiTheme="minorBidi"/>
+        </w:rPr>
+        <w:lastRenderedPageBreak/>
+        <w:drawing>
+          <wp:inline distT="0" distB="0" distL="0" distR="0" wp14:anchorId="5DA0E2A6" wp14:editId="20F6912F">
+            <wp:extent cx="5486400" cy="3035300"/>
+            <wp:effectExtent l="0" t="0" r="0" b="0"/>
+            <wp:docPr id="2131677417" name="Picture 1"/>
+            <wp:cNvGraphicFramePr>
+              <a:graphicFrameLocks xmlns:a="http://schemas.openxmlformats.org/drawingml/2006/main" noChangeAspect="1"/>
+            </wp:cNvGraphicFramePr>
+            <a:graphic xmlns:a="http://schemas.openxmlformats.org/drawingml/2006/main">
+              <a:graphicData uri="http://schemas.openxmlformats.org/drawingml/2006/picture">
+                <pic:pic xmlns:pic="http://schemas.openxmlformats.org/drawingml/2006/picture">
+                  <pic:nvPicPr>
+                    <pic:cNvPr id="2131677417" name=""/>
+                    <pic:cNvPicPr/>
+                  </pic:nvPicPr>
+                  <pic:blipFill>
+                    <a:blip r:embed="rId23"/>
+                    <a:stretch>
+                      <a:fillRect/>
+                    </a:stretch>
+                  </pic:blipFill>
+                  <pic:spPr>
+                    <a:xfrm>
+                      <a:off x="0" y="0"/>
+                      <a:ext cx="5486400" cy="3035300"/>
+                    </a:xfrm>
+                    <a:prstGeom prst="rect">
+                      <a:avLst/>
+                    </a:prstGeom>
+                  </pic:spPr>
+                </pic:pic>
+              </a:graphicData>
+            </a:graphic>
+          </wp:inline>
+        </w:drawing>
+      </w:r>
+    </w:p>
+    <w:p>
+      <w:pPr>
+        <w:pStyle w:val="ListNumber"/>
+        <w:numPr>
+          <w:ilvl w:val="0"/>
+          <w:numId w:val="0"/>
+        </w:numPr>
+        <w:ind w:left="360"/>
+        <w:rPr>
+          <w:rFonts w:asciiTheme="minorBidi" w:hAnsiTheme="minorBidi"/>
+        </w:rPr>
+      </w:pPr>
+      <w:r>
+        <w:rPr>
+          <w:rFonts w:asciiTheme="minorBidi" w:hAnsiTheme="minorBidi"/>
+        </w:rPr>
+        <w:t>Hist plot is best for understanding the spread and skewing of the data. Risk this reduces is spotting a positively skewed distribution.</w:t>
+      </w:r>
+    </w:p>
+    <w:p>
+      <w:pPr>
+        <w:pStyle w:val="ListNumber"/>
+        <w:numPr>
+          <w:ilvl w:val="0"/>
+          <w:numId w:val="0"/>
+        </w:numPr>
+        <w:ind w:left="360"/>
+        <w:rPr>
+          <w:rFonts w:asciiTheme="minorBidi" w:hAnsiTheme="minorBidi"/>
+        </w:rPr>
+      </w:pPr>
+      <w:r>
+        <w:rPr>
+          <w:rFonts w:asciiTheme="minorBidi" w:hAnsiTheme="minorBidi"/>
+        </w:rPr>
+        <w:t xml:space="preserve"> </w:t>
+      </w:r>
+    </w:p>
+    <w:p>
+      <w:pPr>
+        <w:pStyle w:val="ListNumber"/>
+        <w:rPr>
+          <w:rFonts w:asciiTheme="minorBidi" w:hAnsiTheme="minorBidi"/>
+        </w:rPr>
+      </w:pPr>
+      <w:r>
+        <w:rPr>
+          <w:rFonts w:asciiTheme="minorBidi" w:hAnsiTheme="minorBidi"/>
+        </w:rPr>
+        <w:t>Comparison of net_revenue across categories (show uncertainty or variability)</w:t>
+      </w:r>
+    </w:p>
+    <w:p>
+      <w:pPr>
+        <w:pStyle w:val="ListNumber"/>
+        <w:numPr>
+          <w:ilvl w:val="0"/>
+          <w:numId w:val="0"/>
+        </w:numPr>
+        <w:ind w:left="360"/>
+        <w:rPr>
+          <w:rFonts w:asciiTheme="minorBidi" w:hAnsiTheme="minorBidi"/>
+        </w:rPr>
+      </w:pPr>
+      <w:r>
+        <w:rPr>
+          <w:rFonts w:asciiTheme="minorBidi" w:hAnsiTheme="minorBidi"/>
+        </w:rPr>
+        <w:drawing>
+          <wp:inline distT="0" distB="0" distL="0" distR="0" wp14:anchorId="64AF321A" wp14:editId="0019ACE4">
+            <wp:extent cx="5486400" cy="2908300"/>
+            <wp:effectExtent l="0" t="0" r="0" b="6350"/>
+            <wp:docPr id="1157010460" name="Picture 1"/>
+            <wp:cNvGraphicFramePr>
+              <a:graphicFrameLocks xmlns:a="http://schemas.openxmlformats.org/drawingml/2006/main" noChangeAspect="1"/>
+            </wp:cNvGraphicFramePr>
+            <a:graphic xmlns:a="http://schemas.openxmlformats.org/drawingml/2006/main">
+              <a:graphicData uri="http://schemas.openxmlformats.org/drawingml/2006/picture">
+                <pic:pic xmlns:pic="http://schemas.openxmlformats.org/drawingml/2006/picture">
+                  <pic:nvPicPr>
+                    <pic:cNvPr id="1157010460" name=""/>
+                    <pic:cNvPicPr/>
+                  </pic:nvPicPr>
+                  <pic:blipFill>
+                    <a:blip r:embed="rId24"/>
+                    <a:stretch>
+                      <a:fillRect/>
+                    </a:stretch>
+                  </pic:blipFill>
+                  <pic:spPr>
+                    <a:xfrm>
+                      <a:off x="0" y="0"/>
+                      <a:ext cx="5486400" cy="2908300"/>
+                    </a:xfrm>
+                    <a:prstGeom prst="rect">
+                      <a:avLst/>
+                    </a:prstGeom>
+                  </pic:spPr>
+                </pic:pic>
+              </a:graphicData>
+            </a:graphic>
+          </wp:inline>
+        </w:drawing>
+      </w:r>
+    </w:p>
+    <w:p>
+      <w:pPr>
+        <w:pStyle w:val="ListNumber"/>
+        <w:numPr>
+          <w:ilvl w:val="0"/>
+          <w:numId w:val="0"/>
+        </w:numPr>
+        <w:ind w:left="360"/>
+        <w:rPr>
+          <w:rFonts w:asciiTheme="minorBidi" w:hAnsiTheme="minorBidi"/>
+        </w:rPr>
+      </w:pPr>
+      <w:r>
+        <w:rPr>
+          <w:rFonts w:asciiTheme="minorBidi" w:hAnsiTheme="minorBidi"/>
+        </w:rPr>
+        <w:drawing>
+          <wp:inline distT="0" distB="0" distL="0" distR="0" wp14:anchorId="694F54C1" wp14:editId="36A210A1">
+            <wp:extent cx="5486400" cy="314325"/>
+            <wp:effectExtent l="0" t="0" r="0" b="9525"/>
+            <wp:docPr id="386163450" name="Picture 1"/>
+            <wp:cNvGraphicFramePr>
+              <a:graphicFrameLocks xmlns:a="http://schemas.openxmlformats.org/drawingml/2006/main" noChangeAspect="1"/>
+            </wp:cNvGraphicFramePr>
+            <a:graphic xmlns:a="http://schemas.openxmlformats.org/drawingml/2006/main">
+              <a:graphicData uri="http://schemas.openxmlformats.org/drawingml/2006/picture">
+                <pic:pic xmlns:pic="http://schemas.openxmlformats.org/drawingml/2006/picture">
+                  <pic:nvPicPr>
+                    <pic:cNvPr id="386163450" name=""/>
+                    <pic:cNvPicPr/>
+                  </pic:nvPicPr>
+                  <pic:blipFill>
+                    <a:blip r:embed="rId25"/>
+                    <a:stretch>
+                      <a:fillRect/>
+                    </a:stretch>
+                  </pic:blipFill>
+                  <pic:spPr>
+                    <a:xfrm>
+                      <a:off x="0" y="0"/>
+                      <a:ext cx="5486400" cy="314325"/>
+                    </a:xfrm>
+                    <a:prstGeom prst="rect">
+                      <a:avLst/>
+                    </a:prstGeom>
+                  </pic:spPr>
+                </pic:pic>
+              </a:graphicData>
+            </a:graphic>
+          </wp:inline>
+        </w:drawing>
+      </w:r>
+    </w:p>
+    <w:p>
+      <w:pPr>
+        <w:pStyle w:val="ListNumber"/>
+        <w:numPr>
+          <w:ilvl w:val="0"/>
+          <w:numId w:val="0"/>
+        </w:numPr>
+        <w:ind w:left="360"/>
+        <w:rPr>
+          <w:rFonts w:asciiTheme="minorBidi" w:hAnsiTheme="minorBidi"/>
+        </w:rPr>
+      </w:pPr>
+      <w:r>
+        <w:rPr>
+          <w:rFonts w:asciiTheme="minorBidi" w:hAnsiTheme="minorBidi"/>
+        </w:rPr>
+        <w:t xml:space="preserve">Bar plot with error bar is best suited for visualizing the uncertainty and variability. Risk this reduces is to </w:t>
+      </w:r>
+      <w:proofErr w:type="gramStart"/>
+      <w:r>
+        <w:rPr>
+          <w:rFonts w:asciiTheme="minorBidi" w:hAnsiTheme="minorBidi"/>
+        </w:rPr>
+        <w:t>put</w:t>
+      </w:r>
+      <w:proofErr w:type="gramEnd"/>
+      <w:r>
+        <w:rPr>
+          <w:rFonts w:asciiTheme="minorBidi" w:hAnsiTheme="minorBidi"/>
+        </w:rPr>
+        <w:t xml:space="preserve"> more attention </w:t>
+      </w:r>
+      <w:proofErr w:type="gramStart"/>
+      <w:r>
+        <w:rPr>
+          <w:rFonts w:asciiTheme="minorBidi" w:hAnsiTheme="minorBidi"/>
+        </w:rPr>
+        <w:t>towards</w:t>
+      </w:r>
+      <w:proofErr w:type="gramEnd"/>
+      <w:r>
+        <w:rPr>
+          <w:rFonts w:asciiTheme="minorBidi" w:hAnsiTheme="minorBidi"/>
+        </w:rPr>
+        <w:t xml:space="preserve"> the </w:t>
+      </w:r>
+      <w:proofErr w:type="gramStart"/>
+      <w:r>
+        <w:rPr>
+          <w:rFonts w:asciiTheme="minorBidi" w:hAnsiTheme="minorBidi"/>
+        </w:rPr>
+        <w:t>Home</w:t>
+      </w:r>
+      <w:proofErr w:type="gramEnd"/>
+      <w:r>
+        <w:rPr>
+          <w:rFonts w:asciiTheme="minorBidi" w:hAnsiTheme="minorBidi"/>
+        </w:rPr>
+        <w:t xml:space="preserve"> department and not the Electronics (having the lowest net revenue).</w:t>
+      </w:r>
+    </w:p>
+    <w:p>
+      <w:pPr>
+        <w:pStyle w:val="ListNumber"/>
+        <w:numPr>
+          <w:ilvl w:val="0"/>
+          <w:numId w:val="0"/>
+        </w:numPr>
+        <w:ind w:left="360"/>
+        <w:rPr>
+          <w:rFonts w:asciiTheme="minorBidi" w:hAnsiTheme="minorBidi"/>
+        </w:rPr>
+      </w:pPr>
+      <w:r>
+        <w:rPr>
+          <w:rFonts w:asciiTheme="minorBidi" w:hAnsiTheme="minorBidi"/>
+        </w:rPr>
+        <w:t xml:space="preserve"> </w:t>
+      </w:r>
+    </w:p>
+    <w:p>
+      <w:pPr>
+        <w:pStyle w:val="ListNumber"/>
+        <w:rPr>
+          <w:rFonts w:asciiTheme="minorBidi" w:hAnsiTheme="minorBidi"/>
+        </w:rPr>
+      </w:pPr>
+      <w:r>
+        <w:rPr>
+          <w:rFonts w:asciiTheme="minorBidi" w:hAnsiTheme="minorBidi"/>
+        </w:rPr>
+        <w:t>Relationship between income_usd and net_revenue (</w:t>
+      </w:r>
+      <w:proofErr w:type="gramStart"/>
+      <w:r>
+        <w:rPr>
+          <w:rFonts w:asciiTheme="minorBidi" w:hAnsiTheme="minorBidi"/>
+        </w:rPr>
+        <w:t>remember:</w:t>
+      </w:r>
+      <w:proofErr w:type="gramEnd"/>
+      <w:r>
+        <w:rPr>
+          <w:rFonts w:asciiTheme="minorBidi" w:hAnsiTheme="minorBidi"/>
+        </w:rPr>
+        <w:t xml:space="preserve"> correlation does not imply causation)</w:t>
+      </w:r>
+    </w:p>
+    <w:p>
+      <w:pPr>
+        <w:pStyle w:val="ListNumber"/>
+        <w:numPr>
+          <w:ilvl w:val="0"/>
+          <w:numId w:val="0"/>
+        </w:numPr>
+        <w:ind w:left="360"/>
+        <w:rPr>
+          <w:rFonts w:asciiTheme="minorBidi" w:hAnsiTheme="minorBidi"/>
+        </w:rPr>
+      </w:pPr>
+      <w:r>
+        <w:rPr>
+          <w:rFonts w:asciiTheme="minorBidi" w:hAnsiTheme="minorBidi"/>
+        </w:rPr>
+        <w:lastRenderedPageBreak/>
+        <w:drawing>
+          <wp:inline distT="0" distB="0" distL="0" distR="0" wp14:anchorId="29A4FBF2" wp14:editId="4ECC7739">
+            <wp:extent cx="5486400" cy="2919095"/>
+            <wp:effectExtent l="0" t="0" r="0" b="0"/>
+            <wp:docPr id="1996255135" name="Picture 1"/>
+            <wp:cNvGraphicFramePr>
+              <a:graphicFrameLocks xmlns:a="http://schemas.openxmlformats.org/drawingml/2006/main" noChangeAspect="1"/>
+            </wp:cNvGraphicFramePr>
+            <a:graphic xmlns:a="http://schemas.openxmlformats.org/drawingml/2006/main">
+              <a:graphicData uri="http://schemas.openxmlformats.org/drawingml/2006/picture">
+                <pic:pic xmlns:pic="http://schemas.openxmlformats.org/drawingml/2006/picture">
+                  <pic:nvPicPr>
+                    <pic:cNvPr id="1996255135" name=""/>
+                    <pic:cNvPicPr/>
+                  </pic:nvPicPr>
+                  <pic:blipFill>
+                    <a:blip r:embed="rId26"/>
+                    <a:stretch>
+                      <a:fillRect/>
+                    </a:stretch>
+                  </pic:blipFill>
+                  <pic:spPr>
+                    <a:xfrm>
+                      <a:off x="0" y="0"/>
+                      <a:ext cx="5486400" cy="2919095"/>
+                    </a:xfrm>
+                    <a:prstGeom prst="rect">
+                      <a:avLst/>
+                    </a:prstGeom>
+                  </pic:spPr>
+                </pic:pic>
+              </a:graphicData>
+            </a:graphic>
+          </wp:inline>
+        </w:drawing>
+      </w:r>
+    </w:p>
+    <w:p>
+      <w:pPr>
+        <w:pStyle w:val="ListNumber"/>
+        <w:numPr>
+          <w:ilvl w:val="0"/>
+          <w:numId w:val="0"/>
+        </w:numPr>
+        <w:ind w:left="360"/>
+        <w:rPr>
+          <w:rFonts w:asciiTheme="minorBidi" w:hAnsiTheme="minorBidi"/>
+        </w:rPr>
+      </w:pPr>
+      <w:r>
+        <w:rPr>
+          <w:rFonts w:asciiTheme="minorBidi" w:hAnsiTheme="minorBidi"/>
+        </w:rPr>
+        <w:t>Scatter plot is best used to display the relationship among two numeric values (</w:t>
+      </w:r>
+      <w:proofErr w:type="spellStart"/>
+      <w:r>
+        <w:rPr>
+          <w:rFonts w:asciiTheme="minorBidi" w:hAnsiTheme="minorBidi"/>
+        </w:rPr>
+        <w:t>income_usd</w:t>
+      </w:r>
+      <w:proofErr w:type="spellEnd"/>
+      <w:r>
+        <w:rPr>
+          <w:rFonts w:asciiTheme="minorBidi" w:hAnsiTheme="minorBidi"/>
+        </w:rPr>
+        <w:t xml:space="preserve"> and </w:t>
+      </w:r>
+      <w:proofErr w:type="spellStart"/>
+      <w:r>
+        <w:rPr>
+          <w:rFonts w:asciiTheme="minorBidi" w:hAnsiTheme="minorBidi"/>
+        </w:rPr>
+        <w:t>net_revenue</w:t>
+      </w:r>
+      <w:proofErr w:type="spellEnd"/>
+      <w:r>
+        <w:rPr>
+          <w:rFonts w:asciiTheme="minorBidi" w:hAnsiTheme="minorBidi"/>
+        </w:rPr>
+        <w:t xml:space="preserve">). There is no correlation in the plot. A risk it reduces is that there is no correlation between </w:t>
+      </w:r>
+      <w:proofErr w:type="spellStart"/>
+      <w:r>
+        <w:rPr>
+          <w:rFonts w:asciiTheme="minorBidi" w:hAnsiTheme="minorBidi"/>
+        </w:rPr>
+        <w:t>income_usd</w:t>
+      </w:r>
+      <w:proofErr w:type="spellEnd"/>
+      <w:r>
+        <w:rPr>
+          <w:rFonts w:asciiTheme="minorBidi" w:hAnsiTheme="minorBidi"/>
+        </w:rPr>
+        <w:t xml:space="preserve"> and </w:t>
+      </w:r>
+      <w:proofErr w:type="spellStart"/>
+      <w:r>
+        <w:rPr>
+          <w:rFonts w:asciiTheme="minorBidi" w:hAnsiTheme="minorBidi"/>
+        </w:rPr>
+        <w:t>net_revenue</w:t>
+      </w:r>
+      <w:proofErr w:type="spellEnd"/>
+      <w:r>
+        <w:rPr>
+          <w:rFonts w:asciiTheme="minorBidi" w:hAnsiTheme="minorBidi"/>
+        </w:rPr>
+        <w:t>.</w:t>
+      </w:r>
+    </w:p>
+    <w:p>
+      <w:pPr>
+        <w:pStyle w:val="ListNumber"/>
+        <w:numPr>
+          <w:ilvl w:val="0"/>
+          <w:numId w:val="0"/>
+        </w:numPr>
+        <w:ind w:left="360"/>
+        <w:rPr>
+          <w:rFonts w:asciiTheme="minorBidi" w:hAnsiTheme="minorBidi"/>
+        </w:rPr>
+      </w:pPr>
+    </w:p>
+    <w:p>
+      <w:pPr>
+        <w:pStyle w:val="ListNumber"/>
+        <w:rPr>
+          <w:rFonts w:asciiTheme="minorBidi" w:hAnsiTheme="minorBidi"/>
+        </w:rPr>
+      </w:pPr>
+      <w:r>
+        <w:rPr>
+          <w:rFonts w:asciiTheme="minorBidi" w:hAnsiTheme="minorBidi"/>
+        </w:rPr>
+        <w:t>One additional chart supporting a managerial question (your choice)</w:t>
+      </w:r>
+    </w:p>
+    <w:p>
+      <w:pPr>
+        <w:pStyle w:val="ListNumber"/>
+        <w:numPr>
+          <w:ilvl w:val="0"/>
+          <w:numId w:val="0"/>
+        </w:numPr>
+        <w:ind w:left="360"/>
+        <w:rPr>
+          <w:rFonts w:asciiTheme="minorBidi" w:hAnsiTheme="minorBidi"/>
+        </w:rPr>
+      </w:pPr>
+      <w:r>
+        <w:rPr>
+          <w:rFonts w:asciiTheme="minorBidi" w:hAnsiTheme="minorBidi"/>
+        </w:rPr>
+        <w:drawing>
+          <wp:inline distT="0" distB="0" distL="0" distR="0" wp14:anchorId="56333553" wp14:editId="32344306">
+            <wp:extent cx="5486400" cy="2898775"/>
+            <wp:effectExtent l="0" t="0" r="0" b="0"/>
+            <wp:docPr id="449244104" name="Picture 1"/>
+            <wp:cNvGraphicFramePr>
+              <a:graphicFrameLocks xmlns:a="http://schemas.openxmlformats.org/drawingml/2006/main" noChangeAspect="1"/>
+            </wp:cNvGraphicFramePr>
+            <a:graphic xmlns:a="http://schemas.openxmlformats.org/drawingml/2006/main">
+              <a:graphicData uri="http://schemas.openxmlformats.org/drawingml/2006/picture">
+                <pic:pic xmlns:pic="http://schemas.openxmlformats.org/drawingml/2006/picture">
+                  <pic:nvPicPr>
+                    <pic:cNvPr id="449244104" name=""/>
+                    <pic:cNvPicPr/>
+                  </pic:nvPicPr>
+                  <pic:blipFill>
+                    <a:blip r:embed="rId27"/>
+                    <a:stretch>
+                      <a:fillRect/>
+                    </a:stretch>
+                  </pic:blipFill>
+                  <pic:spPr>
+                    <a:xfrm>
+                      <a:off x="0" y="0"/>
+                      <a:ext cx="5486400" cy="2898775"/>
+                    </a:xfrm>
+                    <a:prstGeom prst="rect">
+                      <a:avLst/>
+                    </a:prstGeom>
+                  </pic:spPr>
+                </pic:pic>
+              </a:graphicData>
+            </a:graphic>
+          </wp:inline>
+        </w:drawing>
+      </w:r>
+      <w:r>
+        <w:rPr>
+          <w:rFonts w:asciiTheme="minorBidi" w:hAnsiTheme="minorBidi"/>
+        </w:rPr>
+        <w:t xml:space="preserve"> </w:t>
+      </w:r>
+      <w:r>
+        <w:rPr>
+          <w:rFonts w:asciiTheme="minorBidi" w:hAnsiTheme="minorBidi"/>
+        </w:rPr>
+        <w:t xml:space="preserve"> </w:t>
+      </w:r>
+    </w:p>
+    <w:p>
+      <w:pPr>
+        <w:pStyle w:val="ListNumber"/>
+        <w:numPr>
+          <w:ilvl w:val="0"/>
+          <w:numId w:val="0"/>
+        </w:numPr>
+        <w:ind w:left="360"/>
+        <w:rPr>
+          <w:rFonts w:asciiTheme="minorBidi" w:hAnsiTheme="minorBidi"/>
+        </w:rPr>
+      </w:pPr>
+      <w:r>
+        <w:rPr>
+          <w:rFonts w:asciiTheme="minorBidi" w:hAnsiTheme="minorBidi"/>
+        </w:rPr>
+        <w:t xml:space="preserve">I used box plot because I wanted to examine the median, quartiles, categorical distribution and outliers. A risk is putting </w:t>
+      </w:r>
+      <w:r>
+        <w:rPr>
+          <w:rFonts w:asciiTheme="minorBidi" w:hAnsiTheme="minorBidi"/>
+        </w:rPr>
+        <w:t>too</w:t>
+      </w:r>
+      <w:r>
+        <w:rPr>
+          <w:rFonts w:asciiTheme="minorBidi" w:hAnsiTheme="minorBidi"/>
+        </w:rPr>
+        <w:t xml:space="preserve"> much attention into a category that </w:t>
+      </w:r>
+      <w:r>
+        <w:rPr>
+          <w:rFonts w:asciiTheme="minorBidi" w:hAnsiTheme="minorBidi"/>
+        </w:rPr>
+        <w:t>does not gross much in revenue.</w:t>
+      </w:r>
+    </w:p>
+    <w:p>
+      <w:pPr>
+        <w:rPr>
+          <w:rFonts w:asciiTheme="minorBidi" w:hAnsiTheme="minorBidi"/>
+        </w:rPr>
+      </w:pPr>
+      <w:r>
+        <w:rPr>
+          <w:rFonts w:asciiTheme="minorBidi" w:hAnsiTheme="minorBidi"/>
+        </w:rPr>
+        <w:t>Under each plot, write:</w:t>
+      </w:r>
+    </w:p>
+    <w:p>
+      <w:pPr>
+        <w:pStyle w:val="ListBullet"/>
+        <w:rPr>
+          <w:rFonts w:asciiTheme="minorBidi" w:hAnsiTheme="minorBidi"/>
+        </w:rPr>
+      </w:pPr>
+      <w:r>
+        <w:rPr>
+          <w:rFonts w:asciiTheme="minorBidi" w:hAnsiTheme="minorBidi"/>
+        </w:rPr>
+        <w:t>Why this chart type fits the task</w:t>
+      </w:r>
+    </w:p>
+    <w:p>
+      <w:pPr>
+        <w:pStyle w:val="ListBullet"/>
+        <w:rPr>
+          <w:rFonts w:asciiTheme="minorBidi" w:hAnsiTheme="minorBidi"/>
+        </w:rPr>
+      </w:pPr>
+      <w:r>
+        <w:rPr>
+          <w:rFonts w:asciiTheme="minorBidi" w:hAnsiTheme="minorBidi"/>
+        </w:rPr>
+        <w:lastRenderedPageBreak/>
+        <w:t>One perceptual risk and how you reduced it</w:t>
+      </w:r>
+    </w:p>
+    <w:p>
+      <w:pPr>
+        <w:pStyle w:val="Heading3"/>
+        <w:rPr>
+          <w:rFonts w:asciiTheme="minorBidi" w:hAnsiTheme="minorBidi" w:cstheme="minorBidi"/>
+        </w:rPr>
+      </w:pPr>
+      <w:r>
+        <w:rPr>
+          <w:rFonts w:asciiTheme="minorBidi" w:hAnsiTheme="minorBidi" w:cstheme="minorBidi"/>
+        </w:rPr>
+        <w:t>Q5 (15 pts) — Decision-Ready Visualization (Pipeline Stage: INTERPRETATION)</w:t>
+      </w:r>
+    </w:p>
+    <w:p>
+      <w:pPr>
+        <w:rPr>
+          <w:rFonts w:asciiTheme="minorBidi" w:hAnsiTheme="minorBidi"/>
+        </w:rPr>
+      </w:pPr>
+      <w:r>
+        <w:rPr>
+          <w:rFonts w:asciiTheme="minorBidi" w:hAnsiTheme="minorBidi"/>
+        </w:rPr>
+        <w:t>Create one final visualization that includes:</w:t>
+      </w:r>
+    </w:p>
+    <w:p>
+      <w:pPr>
+        <w:pStyle w:val="ListBullet"/>
+        <w:rPr>
+          <w:rFonts w:asciiTheme="minorBidi" w:hAnsiTheme="minorBidi"/>
+        </w:rPr>
+      </w:pPr>
+      <w:r>
+        <w:rPr>
+          <w:rFonts w:asciiTheme="minorBidi" w:hAnsiTheme="minorBidi"/>
+        </w:rPr>
+        <w:t>A message-driven title stating the conclusion</w:t>
+      </w:r>
+    </w:p>
+    <w:p>
+      <w:pPr>
+        <w:pStyle w:val="ListBullet"/>
+        <w:rPr>
+          <w:rFonts w:asciiTheme="minorBidi" w:hAnsiTheme="minorBidi"/>
+        </w:rPr>
+      </w:pPr>
+      <w:r>
+        <w:rPr>
+          <w:rFonts w:asciiTheme="minorBidi" w:hAnsiTheme="minorBidi"/>
+        </w:rPr>
+        <w:t>Clear axis labels</w:t>
+      </w:r>
+    </w:p>
+    <w:p>
+      <w:pPr>
+        <w:pStyle w:val="ListBullet"/>
+        <w:rPr>
+          <w:rFonts w:asciiTheme="minorBidi" w:hAnsiTheme="minorBidi"/>
+        </w:rPr>
+      </w:pPr>
+      <w:r>
+        <w:rPr>
+          <w:rFonts w:asciiTheme="minorBidi" w:hAnsiTheme="minorBidi"/>
+        </w:rPr>
+        <w:t>A short annotation highlighting key evidence</w:t>
+      </w:r>
+    </w:p>
+    <w:p>
+      <w:pPr>
+        <w:rPr>
+          <w:rFonts w:asciiTheme="minorBidi" w:hAnsiTheme="minorBidi"/>
+        </w:rPr>
+      </w:pPr>
+      <w:r>
+        <w:rPr>
+          <w:rFonts w:asciiTheme="minorBidi" w:hAnsiTheme="minorBidi"/>
+        </w:rPr>
+        <w:t>Write 150–250 words addressing:</w:t>
+      </w:r>
+    </w:p>
+    <w:p>
+      <w:pPr>
+        <w:pStyle w:val="ListBullet"/>
+        <w:rPr>
+          <w:rFonts w:asciiTheme="minorBidi" w:hAnsiTheme="minorBidi"/>
+        </w:rPr>
+      </w:pPr>
+      <w:r>
+        <w:rPr>
+          <w:rFonts w:asciiTheme="minorBidi" w:hAnsiTheme="minorBidi"/>
+        </w:rPr>
+        <w:t>What decision could this visualization support?</w:t>
+      </w:r>
+    </w:p>
+    <w:p>
+      <w:pPr>
+        <w:pStyle w:val="ListBullet"/>
+        <w:rPr>
+          <w:rFonts w:asciiTheme="minorBidi" w:hAnsiTheme="minorBidi"/>
+        </w:rPr>
+      </w:pPr>
+      <w:r>
+        <w:rPr>
+          <w:rFonts w:asciiTheme="minorBidi" w:hAnsiTheme="minorBidi"/>
+        </w:rPr>
+        <w:t>What uncertainty or risk remains?</w:t>
+      </w:r>
+    </w:p>
+    <w:p>
+      <w:pPr>
+        <w:pStyle w:val="ListBullet"/>
+        <w:numPr>
+          <w:ilvl w:val="0"/>
+          <w:numId w:val="0"/>
+        </w:numPr>
+        <w:ind w:left="360"/>
+      </w:pPr>
+      <w:r>
+        <w:rPr>
+          <w:noProof/>
+        </w:rPr>
+        <w:drawing>
+          <wp:inline distT="0" distB="0" distL="0" distR="0" wp14:anchorId="3FE39D78" wp14:editId="2D15C7F1">
+            <wp:extent cx="5486400" cy="4114800"/>
+            <wp:effectExtent l="0" t="0" r="0" b="0"/>
+            <wp:docPr id="454685295" name="Picture 1"/>
+            <wp:cNvGraphicFramePr>
+              <a:graphicFrameLocks xmlns:a="http://schemas.openxmlformats.org/drawingml/2006/main" noChangeAspect="1"/>
+            </wp:cNvGraphicFramePr>
+            <a:graphic xmlns:a="http://schemas.openxmlformats.org/drawingml/2006/main">
+              <a:graphicData uri="http://schemas.openxmlformats.org/drawingml/2006/picture">
+                <pic:pic xmlns:pic="http://schemas.openxmlformats.org/drawingml/2006/picture">
+                  <pic:nvPicPr>
+                    <pic:cNvPr id="0" name="Picture 1"/>
+                    <pic:cNvPicPr>
+                      <a:picLocks noChangeAspect="1" noChangeArrowheads="1"/>
+                    </pic:cNvPicPr>
+                  </pic:nvPicPr>
+                  <pic:blipFill>
+                    <a:blip r:embed="rId28">
+                      <a:extLst>
+                        <a:ext uri="{28A0092B-C50C-407E-A947-70E740481C1C}">
+                          <a14:useLocalDpi xmlns:a14="http://schemas.microsoft.com/office/drawing/2010/main" val="0"/>
+                        </a:ext>
+                      </a:extLst>
+                    </a:blip>
+                    <a:srcRect/>
+                    <a:stretch>
+                      <a:fillRect/>
+                    </a:stretch>
+                  </pic:blipFill>
+                  <pic:spPr bwMode="auto">
+                    <a:xfrm>
+                      <a:off x="0" y="0"/>
+                      <a:ext cx="5486400" cy="4114800"/>
+                    </a:xfrm>
+                    <a:prstGeom prst="rect">
+                      <a:avLst/>
+                    </a:prstGeom>
+                    <a:noFill/>
+                    <a:ln>
+                      <a:noFill/>
+                    </a:ln>
+                  </pic:spPr>
+                </pic:pic>
+              </a:graphicData>
+            </a:graphic>
+          </wp:inline>
+        </w:drawing>
+      </w:r>
+    </w:p>
+    <w:p>
+      <w:pPr>
+        <w:pStyle w:val="ListBullet"/>
+        <w:numPr>
+          <w:ilvl w:val="0"/>
+          <w:numId w:val="0"/>
+        </w:numPr>
+        <w:ind w:left="360"/>
+        <w:rPr>
+          <w:rFonts w:asciiTheme="minorBidi" w:hAnsiTheme="minorBidi"/>
+        </w:rPr>
+      </w:pPr>
+      <w:r>
+        <w:rPr>
+          <w:rFonts w:asciiTheme="minorBidi" w:hAnsiTheme="minorBidi"/>
+        </w:rPr>
+        <w:t xml:space="preserve"> </w:t>
+      </w:r>
+    </w:p>
+    <w:p>
+      <w:pPr>
+        <w:pStyle w:val="ListBullet"/>
+        <w:numPr>
+          <w:ilvl w:val="0"/>
+          <w:numId w:val="0"/>
+        </w:numPr>
+        <w:ind w:left="360"/>
+        <w:rPr>
+          <w:rFonts w:asciiTheme="minorBidi" w:hAnsiTheme="minorBidi"/>
+        </w:rPr>
+      </w:pPr>
+    </w:p>
+    <w:p>
+      <w:pPr>
+        <w:pStyle w:val="ListBullet"/>
+        <w:numPr>
+          <w:ilvl w:val="0"/>
+          <w:numId w:val="0"/>
+        </w:numPr>
+        <w:ind w:left="360"/>
+        <w:rPr>
+          <w:rFonts w:asciiTheme="minorBidi" w:hAnsiTheme="minorBidi"/>
+        </w:rPr>
+      </w:pPr>
+      <w:r>
+        <w:rPr>
+          <w:rFonts w:asciiTheme="minorBidi" w:hAnsiTheme="minorBidi"/>
+        </w:rPr>
+        <w:lastRenderedPageBreak/>
+        <w:drawing>
+          <wp:inline distT="0" distB="0" distL="0" distR="0" wp14:anchorId="21FE9EF9" wp14:editId="3200CB06">
+            <wp:extent cx="5486400" cy="2588895"/>
+            <wp:effectExtent l="0" t="0" r="0" b="1905"/>
+            <wp:docPr id="218145386" name="Picture 1"/>
+            <wp:cNvGraphicFramePr>
+              <a:graphicFrameLocks xmlns:a="http://schemas.openxmlformats.org/drawingml/2006/main" noChangeAspect="1"/>
+            </wp:cNvGraphicFramePr>
+            <a:graphic xmlns:a="http://schemas.openxmlformats.org/drawingml/2006/main">
+              <a:graphicData uri="http://schemas.openxmlformats.org/drawingml/2006/picture">
+                <pic:pic xmlns:pic="http://schemas.openxmlformats.org/drawingml/2006/picture">
+                  <pic:nvPicPr>
+                    <pic:cNvPr id="218145386" name=""/>
+                    <pic:cNvPicPr/>
+                  </pic:nvPicPr>
+                  <pic:blipFill>
+                    <a:blip r:embed="rId29"/>
+                    <a:stretch>
+                      <a:fillRect/>
+                    </a:stretch>
+                  </pic:blipFill>
+                  <pic:spPr>
+                    <a:xfrm>
+                      <a:off x="0" y="0"/>
+                      <a:ext cx="5486400" cy="2588895"/>
+                    </a:xfrm>
+                    <a:prstGeom prst="rect">
+                      <a:avLst/>
+                    </a:prstGeom>
+                  </pic:spPr>
+                </pic:pic>
+              </a:graphicData>
+            </a:graphic>
+          </wp:inline>
+        </w:drawing>
+      </w:r>
+      <w:r>
+        <w:rPr>
+          <w:rFonts w:asciiTheme="minorBidi" w:hAnsiTheme="minorBidi"/>
+        </w:rPr>
+        <w:t xml:space="preserve"> </w:t>
+      </w:r>
+    </w:p>
+    <w:p>
+      <w:pPr>
+        <w:pStyle w:val="ListBullet"/>
+        <w:numPr>
+          <w:ilvl w:val="0"/>
+          <w:numId w:val="0"/>
+        </w:numPr>
+        <w:ind w:left="360"/>
+        <w:rPr>
+          <w:rFonts w:asciiTheme="minorBidi" w:hAnsiTheme="minorBidi"/>
+        </w:rPr>
+      </w:pPr>
+      <w:r>
+        <w:rPr>
+          <w:rFonts w:asciiTheme="minorBidi" w:hAnsiTheme="minorBidi"/>
+        </w:rPr>
+        <w:t xml:space="preserve">Visualize the Density/shape of the Gross revenue among each category with distribution based on region. </w:t>
+      </w:r>
+      <w:r>
+        <w:rPr>
+          <w:rFonts w:asciiTheme="minorBidi" w:hAnsiTheme="minorBidi"/>
+        </w:rPr>
+        <w:t>Whether</w:t>
+      </w:r>
+      <w:r>
+        <w:rPr>
+          <w:rFonts w:asciiTheme="minorBidi" w:hAnsiTheme="minorBidi"/>
+        </w:rPr>
+        <w:t xml:space="preserve"> distribution is bimodal? skewed? Median? </w:t>
+      </w:r>
+      <w:proofErr w:type="gramStart"/>
+      <w:r>
+        <w:rPr>
+          <w:rFonts w:asciiTheme="minorBidi" w:hAnsiTheme="minorBidi"/>
+        </w:rPr>
+        <w:t>Spread?:</w:t>
+      </w:r>
+      <w:proofErr w:type="gramEnd"/>
+    </w:p>
+    <w:p>
+      <w:pPr>
+        <w:pStyle w:val="ListBullet"/>
+        <w:numPr>
+          <w:ilvl w:val="0"/>
+          <w:numId w:val="0"/>
+        </w:numPr>
+        <w:ind w:left="360"/>
+        <w:rPr>
+          <w:rFonts w:asciiTheme="minorBidi" w:hAnsiTheme="minorBidi"/>
+        </w:rPr>
+      </w:pPr>
+      <w:r>
+        <w:rPr>
+          <w:rFonts w:asciiTheme="minorBidi" w:hAnsiTheme="minorBidi"/>
+        </w:rPr>
+        <w:t xml:space="preserve">I used a Violin plot to best show shape/density of the gross revenue among the distribution category/region. Violin plot is best used to show the bimodal distribution. You can see that the West region has more density. East has the less density. Home South has the highest median, but with less density. More density in gross revenue the less the median value. Home department </w:t>
+      </w:r>
+      <w:r>
+        <w:rPr>
+          <w:rFonts w:asciiTheme="minorBidi" w:hAnsiTheme="minorBidi"/>
+        </w:rPr>
+        <w:t>is growing</w:t>
+      </w:r>
+      <w:r>
+        <w:rPr>
+          <w:rFonts w:asciiTheme="minorBidi" w:hAnsiTheme="minorBidi"/>
+        </w:rPr>
+        <w:t xml:space="preserve"> the most in revenue. A risk that can be reduced is by putting less money </w:t>
+      </w:r>
+      <w:r>
+        <w:rPr>
+          <w:rFonts w:asciiTheme="minorBidi" w:hAnsiTheme="minorBidi"/>
+        </w:rPr>
+        <w:t>into</w:t>
+      </w:r>
+      <w:r>
+        <w:rPr>
+          <w:rFonts w:asciiTheme="minorBidi" w:hAnsiTheme="minorBidi"/>
+        </w:rPr>
+        <w:t xml:space="preserve"> the electronics/clothing category.</w:t>
+      </w:r>
+      <w:r>
+        <w:rPr>
+          <w:rFonts w:asciiTheme="minorBidi" w:hAnsiTheme="minorBidi"/>
+        </w:rPr>
+        <w:t xml:space="preserve"> </w:t>
+      </w:r>
+    </w:p>
+    <w:p>
+      <w:pPr>
+        <w:pStyle w:val="Heading3"/>
+        <w:rPr>
+          <w:rFonts w:asciiTheme="minorBidi" w:hAnsiTheme="minorBidi" w:cstheme="minorBidi"/>
+        </w:rPr>
+      </w:pPr>
+      <w:r>
+        <w:rPr>
+          <w:rFonts w:asciiTheme="minorBidi" w:hAnsiTheme="minorBidi" w:cstheme="minorBidi"/>
+        </w:rPr>
+        <w:t xml:space="preserve">Q6 (10 </w:t>
+      </w:r>
+      <w:proofErr w:type="gramStart"/>
+      <w:r>
+        <w:rPr>
+          <w:rFonts w:asciiTheme="minorBidi" w:hAnsiTheme="minorBidi" w:cstheme="minorBidi"/>
+        </w:rPr>
+        <w:t>pts) —</w:t>
+      </w:r>
+      <w:proofErr w:type="gramEnd"/>
+      <w:r>
+        <w:rPr>
+          <w:rFonts w:asciiTheme="minorBidi" w:hAnsiTheme="minorBidi" w:cstheme="minorBidi"/>
+        </w:rPr>
+        <w:t xml:space="preserve"> Reflection</w:t>
+      </w:r>
+    </w:p>
+    <w:p>
+      <w:pPr>
+        <w:pStyle w:val="ListBullet"/>
+        <w:rPr>
+          <w:rFonts w:asciiTheme="minorBidi" w:hAnsiTheme="minorBidi"/>
+        </w:rPr>
+      </w:pPr>
+      <w:r>
+        <w:rPr>
+          <w:rFonts w:asciiTheme="minorBidi" w:hAnsiTheme="minorBidi"/>
+        </w:rPr>
+        <w:t>Which pipeline stage was the most challenging and why?</w:t>
+      </w:r>
+    </w:p>
+    <w:p>
+      <w:pPr>
+        <w:pStyle w:val="ListBullet"/>
+        <w:numPr>
+          <w:ilvl w:val="0"/>
+          <w:numId w:val="0"/>
+        </w:numPr>
+        <w:ind w:left="360"/>
+        <w:rPr>
+          <w:rFonts w:asciiTheme="minorBidi" w:hAnsiTheme="minorBidi"/>
+        </w:rPr>
+      </w:pPr>
+      <w:r>
+        <w:rPr>
+          <w:rFonts w:asciiTheme="minorBidi" w:hAnsiTheme="minorBidi"/>
+        </w:rPr>
+        <w:t>Bar plot with error bars, because I messed up with my implementation.</w:t>
+      </w:r>
+    </w:p>
+    <w:p>
+      <w:pPr>
+        <w:pStyle w:val="ListBullet"/>
+        <w:rPr>
+          <w:rFonts w:asciiTheme="minorBidi" w:hAnsiTheme="minorBidi"/>
+        </w:rPr>
+      </w:pPr>
+      <w:r>
+        <w:rPr>
+          <w:rFonts w:asciiTheme="minorBidi" w:hAnsiTheme="minorBidi"/>
+        </w:rPr>
         <w:t>How could your cleaning choices change the analytical story?</w:t>
+      </w:r>
+    </w:p>
+    <w:p>
+      <w:pPr>
+        <w:pStyle w:val="ListBullet"/>
+        <w:numPr>
+          <w:ilvl w:val="0"/>
+          <w:numId w:val="0"/>
+        </w:numPr>
+        <w:ind w:left="360"/>
+        <w:rPr>
+          <w:rFonts w:asciiTheme="minorBidi" w:hAnsiTheme="minorBidi"/>
+        </w:rPr>
+      </w:pPr>
+    </w:p>
+    <w:p>
+      <w:pPr>
+        <w:pStyle w:val="ListBullet"/>
+        <w:numPr>
+          <w:ilvl w:val="0"/>
+          <w:numId w:val="0"/>
+        </w:numPr>
+        <w:ind w:left="360"/>
+        <w:rPr>
+          <w:rFonts w:asciiTheme="minorBidi" w:hAnsiTheme="minorBidi"/>
+        </w:rPr>
+      </w:pPr>
+      <w:r>
+        <w:rPr>
+          <w:rFonts w:asciiTheme="minorBidi" w:hAnsiTheme="minorBidi"/>
+        </w:rPr>
+        <w:t>The typos mess up with categorizing (plotting the distribution) the values. Missing values can mess with statistical analysis and distribution of the graph. Duplicate values for one column can mess with the uniqueness of the column.</w:t>
       </w:r>
     </w:p>
     <w:sectPr>
-      <w:headerReference w:type="even" r:id="rId8"/>
-      <w:headerReference w:type="default" r:id="rId9"/>
-      <w:footerReference w:type="even" r:id="rId10"/>
-      <w:footerReference w:type="default" r:id="rId11"/>
-      <w:headerReference w:type="first" r:id="rId12"/>
-      <w:footerReference w:type="first" r:id="rId13"/>
+      <w:headerReference w:type="even" r:id="rId30"/>
+      <w:headerReference w:type="default" r:id="rId31"/>
+      <w:footerReference w:type="even" r:id="rId32"/>
+      <w:footerReference w:type="default" r:id="rId33"/>
+      <w:headerReference w:type="first" r:id="rId34"/>
+      <w:footerReference w:type="first" r:id="rId35"/>
       <w:pgSz w:w="12240" w:h="15840"/>
       <w:pgMar w:top="1440" w:right="1800" w:bottom="1440" w:left="1800" w:header="720" w:footer="720" w:gutter="0"/>
       <w:cols w:space="720"/>
@@ -1736,7 +3909,6 @@
   <w:style w:type="character" w:default="1" w:styleId="DefaultParagraphFont">
     <w:name w:val="Default Paragraph Font"/>
     <w:uiPriority w:val="1"/>
-    <w:semiHidden/>
     <w:unhideWhenUsed/>
   </w:style>
   <w:style w:type="table" w:default="1" w:styleId="TableNormal">
@@ -12512,6 +14684,22 @@
         <w:shd w:val="clear" w:color="auto" w:fill="FBCAA2" w:themeFill="accent6" w:themeFillTint="7F"/>
       </w:tcPr>
     </w:tblStylePr>
+  </w:style>
+  <w:style w:type="paragraph" w:styleId="NormalWeb">
+    <w:name w:val="Normal (Web)"/>
+    <w:basedOn w:val="Normal"/>
+    <w:uiPriority w:val="99"/>
+    <w:semiHidden/>
+    <w:unhideWhenUsed/>
+    <w:rsid w:val="00A02042"/>
+    <w:pPr>
+      <w:spacing w:before="100" w:beforeAutospacing="1" w:after="100" w:afterAutospacing="1" w:line="240" w:lineRule="auto"/>
+    </w:pPr>
+    <w:rPr>
+      <w:rFonts w:ascii="Times New Roman" w:eastAsia="Times New Roman" w:hAnsi="Times New Roman" w:cs="Times New Roman"/>
+      <w:sz w:val="24"/>
+      <w:szCs w:val="24"/>
+    </w:rPr>
   </w:style>
 </w:styles>
 </file>

</xml_diff>

<commit_message>
interpretation on the graph.
Signed-off-by: uofl-sbabb <sbabb131@gmail.com>
</commit_message>
<xml_diff>
--- a/Project2/Assignment2-01.docx
+++ b/Project2/Assignment2-01.docx
@@ -14,6 +14,11 @@
           <w:rFonts w:asciiTheme="minorBidi" w:hAnsiTheme="minorBidi" w:cstheme="minorBidi"/>
         </w:rPr>
         <w:t>Dataset Assignment — messy_customer_orders.csv</w:t>
+      </w:r>
+    </w:p>
+    <w:p>
+      <w:r>
+        <w:t>Name: Sydney Babb</w:t>
       </w:r>
     </w:p>
     <w:p>
@@ -308,6 +313,7 @@
       <w:r>
         <w:rPr>
           <w:rFonts w:asciiTheme="minorBidi" w:hAnsiTheme="minorBidi"/>
+          <w:noProof/>
         </w:rPr>
         <w:lastRenderedPageBreak/>
         <w:drawing>
@@ -395,6 +401,7 @@
       <w:r>
         <w:rPr>
           <w:rFonts w:asciiTheme="minorBidi" w:hAnsiTheme="minorBidi"/>
+          <w:noProof/>
         </w:rPr>
         <w:drawing>
           <wp:inline distT="0" distB="0" distL="0" distR="0" wp14:anchorId="45DD4B3B" wp14:editId="12974BF0">
@@ -448,6 +455,7 @@
       <w:r>
         <w:rPr>
           <w:rFonts w:asciiTheme="minorBidi" w:hAnsiTheme="minorBidi"/>
+          <w:noProof/>
         </w:rPr>
         <w:drawing>
           <wp:inline distT="0" distB="0" distL="0" distR="0" wp14:anchorId="5361E24E" wp14:editId="36286773">
@@ -520,6 +528,7 @@
       <w:r>
         <w:rPr>
           <w:rFonts w:asciiTheme="minorBidi" w:hAnsiTheme="minorBidi"/>
+          <w:noProof/>
         </w:rPr>
         <w:lastRenderedPageBreak/>
         <w:drawing>
@@ -593,6 +602,7 @@
       <w:r>
         <w:rPr>
           <w:rFonts w:asciiTheme="minorBidi" w:hAnsiTheme="minorBidi"/>
+          <w:noProof/>
         </w:rPr>
         <w:drawing>
           <wp:inline distT="0" distB="0" distL="0" distR="0" wp14:anchorId="3BCD23E2" wp14:editId="0900F745">
@@ -948,6 +958,7 @@
       <w:r>
         <w:rPr>
           <w:rFonts w:asciiTheme="minorBidi" w:hAnsiTheme="minorBidi"/>
+          <w:noProof/>
         </w:rPr>
         <w:lastRenderedPageBreak/>
         <w:drawing>
@@ -1002,6 +1013,7 @@
       <w:r>
         <w:rPr>
           <w:rFonts w:asciiTheme="minorBidi" w:hAnsiTheme="minorBidi"/>
+          <w:noProof/>
         </w:rPr>
         <w:drawing>
           <wp:inline distT="0" distB="0" distL="0" distR="0" wp14:anchorId="75763842" wp14:editId="5E1FC263">
@@ -1102,6 +1114,7 @@
       <w:r>
         <w:rPr>
           <w:rFonts w:asciiTheme="minorBidi" w:hAnsiTheme="minorBidi"/>
+          <w:noProof/>
         </w:rPr>
         <w:drawing>
           <wp:inline distT="0" distB="0" distL="0" distR="0" wp14:anchorId="6D226C5B" wp14:editId="25648DD4">
@@ -1155,6 +1168,7 @@
       <w:r>
         <w:rPr>
           <w:rFonts w:asciiTheme="minorBidi" w:hAnsiTheme="minorBidi"/>
+          <w:noProof/>
         </w:rPr>
         <w:lastRenderedPageBreak/>
         <w:drawing>
@@ -1228,6 +1242,7 @@
       <w:r>
         <w:rPr>
           <w:rFonts w:asciiTheme="minorBidi" w:hAnsiTheme="minorBidi"/>
+          <w:noProof/>
         </w:rPr>
         <w:drawing>
           <wp:inline distT="0" distB="0" distL="0" distR="0" wp14:anchorId="001C93AB" wp14:editId="694F460F">
@@ -1300,6 +1315,7 @@
       <w:r>
         <w:rPr>
           <w:rFonts w:asciiTheme="minorBidi" w:hAnsiTheme="minorBidi"/>
+          <w:noProof/>
         </w:rPr>
         <w:drawing>
           <wp:inline distT="0" distB="0" distL="0" distR="0" wp14:anchorId="20B7FAA3" wp14:editId="2CBBE99D">
@@ -1386,6 +1402,7 @@
       <w:r>
         <w:rPr>
           <w:rFonts w:asciiTheme="minorBidi" w:hAnsiTheme="minorBidi"/>
+          <w:noProof/>
         </w:rPr>
         <w:lastRenderedPageBreak/>
         <w:drawing>
@@ -1446,6 +1463,7 @@
       <w:r>
         <w:rPr>
           <w:rFonts w:asciiTheme="minorBidi" w:hAnsiTheme="minorBidi"/>
+          <w:noProof/>
         </w:rPr>
         <w:drawing>
           <wp:inline distT="0" distB="0" distL="0" distR="0" wp14:anchorId="108F0BAE" wp14:editId="3BF13133">
@@ -1679,6 +1697,7 @@
       <w:r>
         <w:rPr>
           <w:rFonts w:asciiTheme="minorBidi" w:hAnsiTheme="minorBidi"/>
+          <w:noProof/>
         </w:rPr>
         <w:lastRenderedPageBreak/>
         <w:drawing>
@@ -1753,6 +1772,7 @@
       <w:r>
         <w:rPr>
           <w:rFonts w:asciiTheme="minorBidi" w:hAnsiTheme="minorBidi"/>
+          <w:noProof/>
         </w:rPr>
         <w:drawing>
           <wp:inline distT="0" distB="0" distL="0" distR="0" wp14:anchorId="7E45B82C" wp14:editId="3D65DB4C">
@@ -1900,6 +1920,7 @@
       <w:r>
         <w:rPr>
           <w:rFonts w:asciiTheme="minorBidi" w:hAnsiTheme="minorBidi"/>
+          <w:noProof/>
         </w:rPr>
         <w:lastRenderedPageBreak/>
         <w:drawing>
@@ -2006,6 +2027,7 @@
       <w:r>
         <w:rPr>
           <w:rFonts w:asciiTheme="minorBidi" w:hAnsiTheme="minorBidi"/>
+          <w:noProof/>
         </w:rPr>
         <w:drawing>
           <wp:inline distT="0" distB="0" distL="0" distR="0" wp14:anchorId="64AF321A" wp14:editId="0019ACE4">
@@ -2059,6 +2081,7 @@
       <w:r>
         <w:rPr>
           <w:rFonts w:asciiTheme="minorBidi" w:hAnsiTheme="minorBidi"/>
+          <w:noProof/>
         </w:rPr>
         <w:drawing>
           <wp:inline distT="0" distB="0" distL="0" distR="0" wp14:anchorId="694F54C1" wp14:editId="36A210A1">
@@ -2220,6 +2243,7 @@
       <w:r>
         <w:rPr>
           <w:rFonts w:asciiTheme="minorBidi" w:hAnsiTheme="minorBidi"/>
+          <w:noProof/>
         </w:rPr>
         <w:lastRenderedPageBreak/>
         <w:drawing>
@@ -2376,6 +2400,7 @@
       <w:r>
         <w:rPr>
           <w:rFonts w:asciiTheme="minorBidi" w:hAnsiTheme="minorBidi"/>
+          <w:noProof/>
         </w:rPr>
         <w:drawing>
           <wp:inline distT="0" distB="0" distL="0" distR="0" wp14:anchorId="56333553" wp14:editId="32344306">
@@ -2725,6 +2750,7 @@
       <w:r>
         <w:rPr>
           <w:rFonts w:asciiTheme="minorBidi" w:hAnsiTheme="minorBidi"/>
+          <w:noProof/>
         </w:rPr>
         <w:lastRenderedPageBreak/>
         <w:drawing>
@@ -2786,19 +2812,7 @@
         <w:rPr>
           <w:rFonts w:asciiTheme="minorBidi" w:hAnsiTheme="minorBidi"/>
         </w:rPr>
-        <w:t xml:space="preserve">Visualize the Density/shape of the Gross revenue among each category with distribution based on region. </w:t>
-      </w:r>
-      <w:r>
-        <w:rPr>
-          <w:rFonts w:asciiTheme="minorBidi" w:hAnsiTheme="minorBidi"/>
-        </w:rPr>
-        <w:t>Whether</w:t>
-      </w:r>
-      <w:r>
-        <w:rPr>
-          <w:rFonts w:asciiTheme="minorBidi" w:hAnsiTheme="minorBidi"/>
-        </w:rPr>
-        <w:t xml:space="preserve"> distribution is bimodal? skewed? Median? </w:t>
+        <w:t xml:space="preserve">Visualize the Density/shape of the Gross revenue among each category with distribution based on region. Whether distribution is bimodal? skewed? Median? </w:t>
       </w:r>
       <w:proofErr w:type="gramStart"/>
       <w:r>
@@ -2808,6 +2822,160 @@
         <w:t>Spread?:</w:t>
       </w:r>
       <w:proofErr w:type="gramEnd"/>
+    </w:p>
+    <w:p>
+      <w:pPr>
+        <w:pStyle w:val="ListBullet"/>
+        <w:numPr>
+          <w:ilvl w:val="0"/>
+          <w:numId w:val="12"/>
+        </w:numPr>
+        <w:rPr>
+          <w:rFonts w:asciiTheme="minorBidi" w:hAnsiTheme="minorBidi"/>
+        </w:rPr>
+      </w:pPr>
+      <w:r>
+        <w:rPr>
+          <w:rFonts w:asciiTheme="minorBidi" w:hAnsiTheme="minorBidi"/>
+        </w:rPr>
+        <w:t>I used a Violin plot to best show shape/density of the gross revenue among the distribution category/region. Violin plot is best used to show the bimodal distribution. You can see that the West region has more density. East has the less density. Home South has the highest median, but with less density. More density in gross revenue the less the median value. Home department is growing the most in revenue. A risk that can be reduced is by putting less money into the electronics/clothing category.</w:t>
+      </w:r>
+      <w:r>
+        <w:rPr>
+          <w:rFonts w:asciiTheme="minorBidi" w:hAnsiTheme="minorBidi"/>
+        </w:rPr>
+        <w:t xml:space="preserve"> </w:t>
+      </w:r>
+      <w:r>
+        <w:rPr>
+          <w:rFonts w:asciiTheme="minorBidi" w:hAnsiTheme="minorBidi"/>
+        </w:rPr>
+        <w:t xml:space="preserve"> </w:t>
+      </w:r>
+      <w:r>
+        <w:rPr>
+          <w:rFonts w:asciiTheme="minorBidi" w:hAnsiTheme="minorBidi"/>
+        </w:rPr>
+        <w:t>Across most categories, the East and North regions show higher median revenues (white dots) and broader upper distributions, particularly in Home and Grocery, where the density extends toward higher revenue values. The South region consistently shows lower medians, especially in Sports and Electronics. Additionally, Home and Grocery appear to generate the highest overall revenue potential across regions, with wider distributions and higher upper ranges compared to other categories.</w:t>
+      </w:r>
+      <w:r>
+        <w:rPr>
+          <w:rFonts w:asciiTheme="minorBidi" w:hAnsiTheme="minorBidi"/>
+        </w:rPr>
+        <w:t xml:space="preserve"> </w:t>
+      </w:r>
+      <w:r>
+        <w:rPr>
+          <w:rFonts w:asciiTheme="minorBidi" w:hAnsiTheme="minorBidi"/>
+        </w:rPr>
+        <w:t>This visualization could support decisions about regional investment and inventory</w:t>
+      </w:r>
+      <w:r>
+        <w:rPr>
+          <w:rFonts w:asciiTheme="minorBidi" w:hAnsiTheme="minorBidi"/>
+          <w:b/>
+          <w:bCs/>
+        </w:rPr>
+        <w:t xml:space="preserve"> </w:t>
+      </w:r>
+      <w:r>
+        <w:rPr>
+          <w:rFonts w:asciiTheme="minorBidi" w:hAnsiTheme="minorBidi"/>
+        </w:rPr>
+        <w:t>allocation. For example, leadership might prioritize expanding Home and Grocery product lines in the East and North regions, where revenue potential appears strongest. It could also inform targeted marketing campaigns or resource reallocation away from underperforming region–category combinations</w:t>
+      </w:r>
+      <w:r>
+        <w:rPr>
+          <w:rFonts w:asciiTheme="minorBidi" w:hAnsiTheme="minorBidi"/>
+        </w:rPr>
+        <w:t xml:space="preserve">. </w:t>
+      </w:r>
+      <w:r>
+        <w:rPr>
+          <w:rFonts w:asciiTheme="minorBidi" w:hAnsiTheme="minorBidi"/>
+        </w:rPr>
+        <w:t>The plot shows distribution shape but not sample size, profitability, cost structure, or growth trends. High revenue variability suggests sales volatility risk, particularly in categories with wide spreads.</w:t>
+      </w:r>
+      <w:r>
+        <w:rPr>
+          <w:rFonts w:asciiTheme="minorBidi" w:hAnsiTheme="minorBidi"/>
+        </w:rPr>
+        <w:t xml:space="preserve"> </w:t>
+      </w:r>
+    </w:p>
+    <w:p>
+      <w:pPr>
+        <w:pStyle w:val="Heading3"/>
+        <w:rPr>
+          <w:rFonts w:asciiTheme="minorBidi" w:hAnsiTheme="minorBidi" w:cstheme="minorBidi"/>
+        </w:rPr>
+      </w:pPr>
+      <w:r>
+        <w:rPr>
+          <w:rFonts w:asciiTheme="minorBidi" w:hAnsiTheme="minorBidi" w:cstheme="minorBidi"/>
+        </w:rPr>
+        <w:t xml:space="preserve">Q6 (10 </w:t>
+      </w:r>
+      <w:proofErr w:type="gramStart"/>
+      <w:r>
+        <w:rPr>
+          <w:rFonts w:asciiTheme="minorBidi" w:hAnsiTheme="minorBidi" w:cstheme="minorBidi"/>
+        </w:rPr>
+        <w:t>pts) —</w:t>
+      </w:r>
+      <w:proofErr w:type="gramEnd"/>
+      <w:r>
+        <w:rPr>
+          <w:rFonts w:asciiTheme="minorBidi" w:hAnsiTheme="minorBidi" w:cstheme="minorBidi"/>
+        </w:rPr>
+        <w:t xml:space="preserve"> Reflection</w:t>
+      </w:r>
+    </w:p>
+    <w:p>
+      <w:pPr>
+        <w:pStyle w:val="ListBullet"/>
+        <w:rPr>
+          <w:rFonts w:asciiTheme="minorBidi" w:hAnsiTheme="minorBidi"/>
+        </w:rPr>
+      </w:pPr>
+      <w:r>
+        <w:rPr>
+          <w:rFonts w:asciiTheme="minorBidi" w:hAnsiTheme="minorBidi"/>
+        </w:rPr>
+        <w:t>Which pipeline stage was the most challenging and why?</w:t>
+      </w:r>
+    </w:p>
+    <w:p>
+      <w:pPr>
+        <w:pStyle w:val="ListBullet"/>
+        <w:numPr>
+          <w:ilvl w:val="0"/>
+          <w:numId w:val="11"/>
+        </w:numPr>
+        <w:rPr>
+          <w:rFonts w:asciiTheme="minorBidi" w:hAnsiTheme="minorBidi"/>
+        </w:rPr>
+      </w:pPr>
+      <w:r>
+        <w:rPr>
+          <w:rFonts w:asciiTheme="minorBidi" w:hAnsiTheme="minorBidi"/>
+        </w:rPr>
+        <w:t>Bar plot with error bars, because I messed up with my implementation.</w:t>
+      </w:r>
+    </w:p>
+    <w:p>
+      <w:pPr>
+        <w:pStyle w:val="ListBullet"/>
+        <w:rPr>
+          <w:rFonts w:asciiTheme="minorBidi" w:hAnsiTheme="minorBidi"/>
+        </w:rPr>
+      </w:pPr>
+      <w:r>
+        <w:rPr>
+          <w:rFonts w:asciiTheme="minorBidi" w:hAnsiTheme="minorBidi"/>
+        </w:rPr>
+        <w:t>How could your cleaning choices change the analytical story?</w:t>
+      </w:r>
     </w:p>
     <w:p>
       <w:pPr>
@@ -2821,139 +2989,14 @@
           <w:rFonts w:asciiTheme="minorBidi" w:hAnsiTheme="minorBidi"/>
         </w:rPr>
       </w:pPr>
-      <w:r>
-        <w:rPr>
-          <w:rFonts w:asciiTheme="minorBidi" w:hAnsiTheme="minorBidi"/>
-        </w:rPr>
-        <w:t xml:space="preserve">I used a Violin plot to best show shape/density of the gross revenue among the distribution category/region. Violin plot is best used to show the bimodal distribution. You can see that the West region has more density. East has the less density. Home South has the highest median, but with less density. More density in gross revenue the less the median value. Home department </w:t>
-      </w:r>
-      <w:r>
-        <w:rPr>
-          <w:rFonts w:asciiTheme="minorBidi" w:hAnsiTheme="minorBidi"/>
-        </w:rPr>
-        <w:t>is growing</w:t>
-      </w:r>
-      <w:r>
-        <w:rPr>
-          <w:rFonts w:asciiTheme="minorBidi" w:hAnsiTheme="minorBidi"/>
-        </w:rPr>
-        <w:t xml:space="preserve"> the most in revenue. A risk that can be reduced is by putting less money </w:t>
-      </w:r>
-      <w:r>
-        <w:rPr>
-          <w:rFonts w:asciiTheme="minorBidi" w:hAnsiTheme="minorBidi"/>
-        </w:rPr>
-        <w:t>into</w:t>
-      </w:r>
-      <w:r>
-        <w:rPr>
-          <w:rFonts w:asciiTheme="minorBidi" w:hAnsiTheme="minorBidi"/>
-        </w:rPr>
-        <w:t xml:space="preserve"> the electronics/clothing category.</w:t>
-      </w:r>
-      <w:r>
-        <w:rPr>
-          <w:rFonts w:asciiTheme="minorBidi" w:hAnsiTheme="minorBidi"/>
-        </w:rPr>
-        <w:t xml:space="preserve"> </w:t>
-      </w:r>
-    </w:p>
-    <w:p>
-      <w:pPr>
-        <w:pStyle w:val="Heading3"/>
-        <w:rPr>
-          <w:rFonts w:asciiTheme="minorBidi" w:hAnsiTheme="minorBidi" w:cstheme="minorBidi"/>
-        </w:rPr>
-      </w:pPr>
-      <w:r>
-        <w:rPr>
-          <w:rFonts w:asciiTheme="minorBidi" w:hAnsiTheme="minorBidi" w:cstheme="minorBidi"/>
-        </w:rPr>
-        <w:t xml:space="preserve">Q6 (10 </w:t>
-      </w:r>
-      <w:proofErr w:type="gramStart"/>
-      <w:r>
-        <w:rPr>
-          <w:rFonts w:asciiTheme="minorBidi" w:hAnsiTheme="minorBidi" w:cstheme="minorBidi"/>
-        </w:rPr>
-        <w:t>pts) —</w:t>
-      </w:r>
-      <w:proofErr w:type="gramEnd"/>
-      <w:r>
-        <w:rPr>
-          <w:rFonts w:asciiTheme="minorBidi" w:hAnsiTheme="minorBidi" w:cstheme="minorBidi"/>
-        </w:rPr>
-        <w:t xml:space="preserve"> Reflection</w:t>
-      </w:r>
-    </w:p>
-    <w:p>
-      <w:pPr>
-        <w:pStyle w:val="ListBullet"/>
-        <w:rPr>
-          <w:rFonts w:asciiTheme="minorBidi" w:hAnsiTheme="minorBidi"/>
-        </w:rPr>
-      </w:pPr>
-      <w:r>
-        <w:rPr>
-          <w:rFonts w:asciiTheme="minorBidi" w:hAnsiTheme="minorBidi"/>
-        </w:rPr>
-        <w:t>Which pipeline stage was the most challenging and why?</w:t>
-      </w:r>
     </w:p>
     <w:p>
       <w:pPr>
         <w:pStyle w:val="ListBullet"/>
         <w:numPr>
           <w:ilvl w:val="0"/>
-          <w:numId w:val="0"/>
+          <w:numId w:val="10"/>
         </w:numPr>
-        <w:ind w:left="360"/>
-        <w:rPr>
-          <w:rFonts w:asciiTheme="minorBidi" w:hAnsiTheme="minorBidi"/>
-        </w:rPr>
-      </w:pPr>
-      <w:r>
-        <w:rPr>
-          <w:rFonts w:asciiTheme="minorBidi" w:hAnsiTheme="minorBidi"/>
-        </w:rPr>
-        <w:t>Bar plot with error bars, because I messed up with my implementation.</w:t>
-      </w:r>
-    </w:p>
-    <w:p>
-      <w:pPr>
-        <w:pStyle w:val="ListBullet"/>
-        <w:rPr>
-          <w:rFonts w:asciiTheme="minorBidi" w:hAnsiTheme="minorBidi"/>
-        </w:rPr>
-      </w:pPr>
-      <w:r>
-        <w:rPr>
-          <w:rFonts w:asciiTheme="minorBidi" w:hAnsiTheme="minorBidi"/>
-        </w:rPr>
-        <w:t>How could your cleaning choices change the analytical story?</w:t>
-      </w:r>
-    </w:p>
-    <w:p>
-      <w:pPr>
-        <w:pStyle w:val="ListBullet"/>
-        <w:numPr>
-          <w:ilvl w:val="0"/>
-          <w:numId w:val="0"/>
-        </w:numPr>
-        <w:ind w:left="360"/>
-        <w:rPr>
-          <w:rFonts w:asciiTheme="minorBidi" w:hAnsiTheme="minorBidi"/>
-        </w:rPr>
-      </w:pPr>
-    </w:p>
-    <w:p>
-      <w:pPr>
-        <w:pStyle w:val="ListBullet"/>
-        <w:numPr>
-          <w:ilvl w:val="0"/>
-          <w:numId w:val="0"/>
-        </w:numPr>
-        <w:ind w:left="360"/>
         <w:rPr>
           <w:rFonts w:asciiTheme="minorBidi" w:hAnsiTheme="minorBidi"/>
         </w:rPr>
@@ -3258,7 +3301,7 @@
   <w:abstractNum w:abstractNumId="8" w15:restartNumberingAfterBreak="0">
     <w:nsid w:val="FFFFFF89"/>
     <w:multiLevelType w:val="singleLevel"/>
-    <w:tmpl w:val="29761A62"/>
+    <w:tmpl w:val="0FA0EA2A"/>
     <w:lvl w:ilvl="0">
       <w:start w:val="1"/>
       <w:numFmt w:val="bullet"/>
@@ -3273,6 +3316,342 @@
       </w:pPr>
       <w:rPr>
         <w:rFonts w:ascii="Symbol" w:hAnsi="Symbol" w:hint="default"/>
+      </w:rPr>
+    </w:lvl>
+  </w:abstractNum>
+  <w:abstractNum w:abstractNumId="9" w15:restartNumberingAfterBreak="0">
+    <w:nsid w:val="2F41100D"/>
+    <w:multiLevelType w:val="hybridMultilevel"/>
+    <w:tmpl w:val="6A9E9478"/>
+    <w:lvl w:ilvl="0" w:tplc="5FCECF12">
+      <w:numFmt w:val="bullet"/>
+      <w:lvlText w:val="-"/>
+      <w:lvlJc w:val="left"/>
+      <w:pPr>
+        <w:ind w:left="720" w:hanging="360"/>
+      </w:pPr>
+      <w:rPr>
+        <w:rFonts w:ascii="Arial" w:eastAsiaTheme="minorEastAsia" w:hAnsi="Arial" w:cs="Arial" w:hint="default"/>
+      </w:rPr>
+    </w:lvl>
+    <w:lvl w:ilvl="1" w:tplc="04090003" w:tentative="1">
+      <w:start w:val="1"/>
+      <w:numFmt w:val="bullet"/>
+      <w:lvlText w:val="o"/>
+      <w:lvlJc w:val="left"/>
+      <w:pPr>
+        <w:ind w:left="1440" w:hanging="360"/>
+      </w:pPr>
+      <w:rPr>
+        <w:rFonts w:ascii="Courier New" w:hAnsi="Courier New" w:cs="Courier New" w:hint="default"/>
+      </w:rPr>
+    </w:lvl>
+    <w:lvl w:ilvl="2" w:tplc="04090005" w:tentative="1">
+      <w:start w:val="1"/>
+      <w:numFmt w:val="bullet"/>
+      <w:lvlText w:val=""/>
+      <w:lvlJc w:val="left"/>
+      <w:pPr>
+        <w:ind w:left="2160" w:hanging="360"/>
+      </w:pPr>
+      <w:rPr>
+        <w:rFonts w:ascii="Wingdings" w:hAnsi="Wingdings" w:hint="default"/>
+      </w:rPr>
+    </w:lvl>
+    <w:lvl w:ilvl="3" w:tplc="04090001" w:tentative="1">
+      <w:start w:val="1"/>
+      <w:numFmt w:val="bullet"/>
+      <w:lvlText w:val=""/>
+      <w:lvlJc w:val="left"/>
+      <w:pPr>
+        <w:ind w:left="2880" w:hanging="360"/>
+      </w:pPr>
+      <w:rPr>
+        <w:rFonts w:ascii="Symbol" w:hAnsi="Symbol" w:hint="default"/>
+      </w:rPr>
+    </w:lvl>
+    <w:lvl w:ilvl="4" w:tplc="04090003" w:tentative="1">
+      <w:start w:val="1"/>
+      <w:numFmt w:val="bullet"/>
+      <w:lvlText w:val="o"/>
+      <w:lvlJc w:val="left"/>
+      <w:pPr>
+        <w:ind w:left="3600" w:hanging="360"/>
+      </w:pPr>
+      <w:rPr>
+        <w:rFonts w:ascii="Courier New" w:hAnsi="Courier New" w:cs="Courier New" w:hint="default"/>
+      </w:rPr>
+    </w:lvl>
+    <w:lvl w:ilvl="5" w:tplc="04090005" w:tentative="1">
+      <w:start w:val="1"/>
+      <w:numFmt w:val="bullet"/>
+      <w:lvlText w:val=""/>
+      <w:lvlJc w:val="left"/>
+      <w:pPr>
+        <w:ind w:left="4320" w:hanging="360"/>
+      </w:pPr>
+      <w:rPr>
+        <w:rFonts w:ascii="Wingdings" w:hAnsi="Wingdings" w:hint="default"/>
+      </w:rPr>
+    </w:lvl>
+    <w:lvl w:ilvl="6" w:tplc="04090001" w:tentative="1">
+      <w:start w:val="1"/>
+      <w:numFmt w:val="bullet"/>
+      <w:lvlText w:val=""/>
+      <w:lvlJc w:val="left"/>
+      <w:pPr>
+        <w:ind w:left="5040" w:hanging="360"/>
+      </w:pPr>
+      <w:rPr>
+        <w:rFonts w:ascii="Symbol" w:hAnsi="Symbol" w:hint="default"/>
+      </w:rPr>
+    </w:lvl>
+    <w:lvl w:ilvl="7" w:tplc="04090003" w:tentative="1">
+      <w:start w:val="1"/>
+      <w:numFmt w:val="bullet"/>
+      <w:lvlText w:val="o"/>
+      <w:lvlJc w:val="left"/>
+      <w:pPr>
+        <w:ind w:left="5760" w:hanging="360"/>
+      </w:pPr>
+      <w:rPr>
+        <w:rFonts w:ascii="Courier New" w:hAnsi="Courier New" w:cs="Courier New" w:hint="default"/>
+      </w:rPr>
+    </w:lvl>
+    <w:lvl w:ilvl="8" w:tplc="04090005" w:tentative="1">
+      <w:start w:val="1"/>
+      <w:numFmt w:val="bullet"/>
+      <w:lvlText w:val=""/>
+      <w:lvlJc w:val="left"/>
+      <w:pPr>
+        <w:ind w:left="6480" w:hanging="360"/>
+      </w:pPr>
+      <w:rPr>
+        <w:rFonts w:ascii="Wingdings" w:hAnsi="Wingdings" w:hint="default"/>
+      </w:rPr>
+    </w:lvl>
+  </w:abstractNum>
+  <w:abstractNum w:abstractNumId="10" w15:restartNumberingAfterBreak="0">
+    <w:nsid w:val="45C85C56"/>
+    <w:multiLevelType w:val="hybridMultilevel"/>
+    <w:tmpl w:val="A60CA464"/>
+    <w:lvl w:ilvl="0" w:tplc="BA6C750A">
+      <w:numFmt w:val="bullet"/>
+      <w:lvlText w:val="-"/>
+      <w:lvlJc w:val="left"/>
+      <w:pPr>
+        <w:ind w:left="720" w:hanging="360"/>
+      </w:pPr>
+      <w:rPr>
+        <w:rFonts w:ascii="Arial" w:eastAsiaTheme="minorEastAsia" w:hAnsi="Arial" w:cs="Arial" w:hint="default"/>
+      </w:rPr>
+    </w:lvl>
+    <w:lvl w:ilvl="1" w:tplc="04090003" w:tentative="1">
+      <w:start w:val="1"/>
+      <w:numFmt w:val="bullet"/>
+      <w:lvlText w:val="o"/>
+      <w:lvlJc w:val="left"/>
+      <w:pPr>
+        <w:ind w:left="1440" w:hanging="360"/>
+      </w:pPr>
+      <w:rPr>
+        <w:rFonts w:ascii="Courier New" w:hAnsi="Courier New" w:cs="Courier New" w:hint="default"/>
+      </w:rPr>
+    </w:lvl>
+    <w:lvl w:ilvl="2" w:tplc="04090005" w:tentative="1">
+      <w:start w:val="1"/>
+      <w:numFmt w:val="bullet"/>
+      <w:lvlText w:val=""/>
+      <w:lvlJc w:val="left"/>
+      <w:pPr>
+        <w:ind w:left="2160" w:hanging="360"/>
+      </w:pPr>
+      <w:rPr>
+        <w:rFonts w:ascii="Wingdings" w:hAnsi="Wingdings" w:hint="default"/>
+      </w:rPr>
+    </w:lvl>
+    <w:lvl w:ilvl="3" w:tplc="04090001" w:tentative="1">
+      <w:start w:val="1"/>
+      <w:numFmt w:val="bullet"/>
+      <w:lvlText w:val=""/>
+      <w:lvlJc w:val="left"/>
+      <w:pPr>
+        <w:ind w:left="2880" w:hanging="360"/>
+      </w:pPr>
+      <w:rPr>
+        <w:rFonts w:ascii="Symbol" w:hAnsi="Symbol" w:hint="default"/>
+      </w:rPr>
+    </w:lvl>
+    <w:lvl w:ilvl="4" w:tplc="04090003" w:tentative="1">
+      <w:start w:val="1"/>
+      <w:numFmt w:val="bullet"/>
+      <w:lvlText w:val="o"/>
+      <w:lvlJc w:val="left"/>
+      <w:pPr>
+        <w:ind w:left="3600" w:hanging="360"/>
+      </w:pPr>
+      <w:rPr>
+        <w:rFonts w:ascii="Courier New" w:hAnsi="Courier New" w:cs="Courier New" w:hint="default"/>
+      </w:rPr>
+    </w:lvl>
+    <w:lvl w:ilvl="5" w:tplc="04090005" w:tentative="1">
+      <w:start w:val="1"/>
+      <w:numFmt w:val="bullet"/>
+      <w:lvlText w:val=""/>
+      <w:lvlJc w:val="left"/>
+      <w:pPr>
+        <w:ind w:left="4320" w:hanging="360"/>
+      </w:pPr>
+      <w:rPr>
+        <w:rFonts w:ascii="Wingdings" w:hAnsi="Wingdings" w:hint="default"/>
+      </w:rPr>
+    </w:lvl>
+    <w:lvl w:ilvl="6" w:tplc="04090001" w:tentative="1">
+      <w:start w:val="1"/>
+      <w:numFmt w:val="bullet"/>
+      <w:lvlText w:val=""/>
+      <w:lvlJc w:val="left"/>
+      <w:pPr>
+        <w:ind w:left="5040" w:hanging="360"/>
+      </w:pPr>
+      <w:rPr>
+        <w:rFonts w:ascii="Symbol" w:hAnsi="Symbol" w:hint="default"/>
+      </w:rPr>
+    </w:lvl>
+    <w:lvl w:ilvl="7" w:tplc="04090003" w:tentative="1">
+      <w:start w:val="1"/>
+      <w:numFmt w:val="bullet"/>
+      <w:lvlText w:val="o"/>
+      <w:lvlJc w:val="left"/>
+      <w:pPr>
+        <w:ind w:left="5760" w:hanging="360"/>
+      </w:pPr>
+      <w:rPr>
+        <w:rFonts w:ascii="Courier New" w:hAnsi="Courier New" w:cs="Courier New" w:hint="default"/>
+      </w:rPr>
+    </w:lvl>
+    <w:lvl w:ilvl="8" w:tplc="04090005" w:tentative="1">
+      <w:start w:val="1"/>
+      <w:numFmt w:val="bullet"/>
+      <w:lvlText w:val=""/>
+      <w:lvlJc w:val="left"/>
+      <w:pPr>
+        <w:ind w:left="6480" w:hanging="360"/>
+      </w:pPr>
+      <w:rPr>
+        <w:rFonts w:ascii="Wingdings" w:hAnsi="Wingdings" w:hint="default"/>
+      </w:rPr>
+    </w:lvl>
+  </w:abstractNum>
+  <w:abstractNum w:abstractNumId="11" w15:restartNumberingAfterBreak="0">
+    <w:nsid w:val="4A8801D5"/>
+    <w:multiLevelType w:val="hybridMultilevel"/>
+    <w:tmpl w:val="30FCC3EC"/>
+    <w:lvl w:ilvl="0" w:tplc="EEBA0FD2">
+      <w:numFmt w:val="bullet"/>
+      <w:lvlText w:val="-"/>
+      <w:lvlJc w:val="left"/>
+      <w:pPr>
+        <w:ind w:left="720" w:hanging="360"/>
+      </w:pPr>
+      <w:rPr>
+        <w:rFonts w:ascii="Arial" w:eastAsiaTheme="minorEastAsia" w:hAnsi="Arial" w:cs="Arial" w:hint="default"/>
+      </w:rPr>
+    </w:lvl>
+    <w:lvl w:ilvl="1" w:tplc="04090003" w:tentative="1">
+      <w:start w:val="1"/>
+      <w:numFmt w:val="bullet"/>
+      <w:lvlText w:val="o"/>
+      <w:lvlJc w:val="left"/>
+      <w:pPr>
+        <w:ind w:left="1440" w:hanging="360"/>
+      </w:pPr>
+      <w:rPr>
+        <w:rFonts w:ascii="Courier New" w:hAnsi="Courier New" w:cs="Courier New" w:hint="default"/>
+      </w:rPr>
+    </w:lvl>
+    <w:lvl w:ilvl="2" w:tplc="04090005" w:tentative="1">
+      <w:start w:val="1"/>
+      <w:numFmt w:val="bullet"/>
+      <w:lvlText w:val=""/>
+      <w:lvlJc w:val="left"/>
+      <w:pPr>
+        <w:ind w:left="2160" w:hanging="360"/>
+      </w:pPr>
+      <w:rPr>
+        <w:rFonts w:ascii="Wingdings" w:hAnsi="Wingdings" w:hint="default"/>
+      </w:rPr>
+    </w:lvl>
+    <w:lvl w:ilvl="3" w:tplc="04090001" w:tentative="1">
+      <w:start w:val="1"/>
+      <w:numFmt w:val="bullet"/>
+      <w:lvlText w:val=""/>
+      <w:lvlJc w:val="left"/>
+      <w:pPr>
+        <w:ind w:left="2880" w:hanging="360"/>
+      </w:pPr>
+      <w:rPr>
+        <w:rFonts w:ascii="Symbol" w:hAnsi="Symbol" w:hint="default"/>
+      </w:rPr>
+    </w:lvl>
+    <w:lvl w:ilvl="4" w:tplc="04090003" w:tentative="1">
+      <w:start w:val="1"/>
+      <w:numFmt w:val="bullet"/>
+      <w:lvlText w:val="o"/>
+      <w:lvlJc w:val="left"/>
+      <w:pPr>
+        <w:ind w:left="3600" w:hanging="360"/>
+      </w:pPr>
+      <w:rPr>
+        <w:rFonts w:ascii="Courier New" w:hAnsi="Courier New" w:cs="Courier New" w:hint="default"/>
+      </w:rPr>
+    </w:lvl>
+    <w:lvl w:ilvl="5" w:tplc="04090005" w:tentative="1">
+      <w:start w:val="1"/>
+      <w:numFmt w:val="bullet"/>
+      <w:lvlText w:val=""/>
+      <w:lvlJc w:val="left"/>
+      <w:pPr>
+        <w:ind w:left="4320" w:hanging="360"/>
+      </w:pPr>
+      <w:rPr>
+        <w:rFonts w:ascii="Wingdings" w:hAnsi="Wingdings" w:hint="default"/>
+      </w:rPr>
+    </w:lvl>
+    <w:lvl w:ilvl="6" w:tplc="04090001" w:tentative="1">
+      <w:start w:val="1"/>
+      <w:numFmt w:val="bullet"/>
+      <w:lvlText w:val=""/>
+      <w:lvlJc w:val="left"/>
+      <w:pPr>
+        <w:ind w:left="5040" w:hanging="360"/>
+      </w:pPr>
+      <w:rPr>
+        <w:rFonts w:ascii="Symbol" w:hAnsi="Symbol" w:hint="default"/>
+      </w:rPr>
+    </w:lvl>
+    <w:lvl w:ilvl="7" w:tplc="04090003" w:tentative="1">
+      <w:start w:val="1"/>
+      <w:numFmt w:val="bullet"/>
+      <w:lvlText w:val="o"/>
+      <w:lvlJc w:val="left"/>
+      <w:pPr>
+        <w:ind w:left="5760" w:hanging="360"/>
+      </w:pPr>
+      <w:rPr>
+        <w:rFonts w:ascii="Courier New" w:hAnsi="Courier New" w:cs="Courier New" w:hint="default"/>
+      </w:rPr>
+    </w:lvl>
+    <w:lvl w:ilvl="8" w:tplc="04090005" w:tentative="1">
+      <w:start w:val="1"/>
+      <w:numFmt w:val="bullet"/>
+      <w:lvlText w:val=""/>
+      <w:lvlJc w:val="left"/>
+      <w:pPr>
+        <w:ind w:left="6480" w:hanging="360"/>
+      </w:pPr>
+      <w:rPr>
+        <w:rFonts w:ascii="Wingdings" w:hAnsi="Wingdings" w:hint="default"/>
       </w:rPr>
     </w:lvl>
   </w:abstractNum>
@@ -3302,6 +3681,15 @@
   </w:num>
   <w:num w:numId="9" w16cid:durableId="1941908753">
     <w:abstractNumId w:val="0"/>
+  </w:num>
+  <w:num w:numId="10" w16cid:durableId="71968979">
+    <w:abstractNumId w:val="10"/>
+  </w:num>
+  <w:num w:numId="11" w16cid:durableId="1704670655">
+    <w:abstractNumId w:val="9"/>
+  </w:num>
+  <w:num w:numId="12" w16cid:durableId="835339785">
+    <w:abstractNumId w:val="11"/>
   </w:num>
 </w:numbering>
 </file>

</xml_diff>